<commit_message>
I updated the SortUserRecords methods
Now the record list will be sorted via the correct way of the strategy design pattern.
</commit_message>
<xml_diff>
--- a/איפיון_מערכת_אפליקציה.docx
+++ b/איפיון_מערכת_אפליקציה.docx
@@ -2421,7 +2421,7 @@
           </mc:Choice>
           <mc:Fallback>
             <w:pict>
-              <v:shapetype w14:anchorId="684DE216" id="_x0000_t32" coordsize="21600,21600" o:spt="32" o:oned="t" path="m,l21600,21600e" filled="f">
+              <v:shapetype w14:anchorId="339E9B87" id="_x0000_t32" coordsize="21600,21600" o:spt="32" o:oned="t" path="m,l21600,21600e" filled="f">
                 <v:path arrowok="t" fillok="f" o:connecttype="none"/>
                 <o:lock v:ext="edit" shapetype="t"/>
               </v:shapetype>
@@ -2488,7 +2488,7 @@
           </mc:Choice>
           <mc:Fallback>
             <w:pict>
-              <v:shape w14:anchorId="260F1512" id="Straight Arrow Connector 7" o:spid="_x0000_s1026" type="#_x0000_t32" style="position:absolute;margin-left:332.35pt;margin-top:241.45pt;width:102.8pt;height:6.6pt;flip:x y;z-index:251688960;visibility:visible;mso-wrap-style:square;mso-wrap-distance-left:9pt;mso-wrap-distance-top:0;mso-wrap-distance-right:9pt;mso-wrap-distance-bottom:0;mso-position-horizontal:absolute;mso-position-horizontal-relative:text;mso-position-vertical:absolute;mso-position-vertical-relative:text" o:gfxdata="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" strokeweight=".52906mm">
+              <v:shape w14:anchorId="6DB99997" id="Straight Arrow Connector 7" o:spid="_x0000_s1026" type="#_x0000_t32" style="position:absolute;margin-left:332.35pt;margin-top:241.45pt;width:102.8pt;height:6.6pt;flip:x y;z-index:251688960;visibility:visible;mso-wrap-style:square;mso-wrap-distance-left:9pt;mso-wrap-distance-top:0;mso-wrap-distance-right:9pt;mso-wrap-distance-bottom:0;mso-position-horizontal:absolute;mso-position-horizontal-relative:text;mso-position-vertical:absolute;mso-position-vertical-relative:text" o:gfxdata="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" strokeweight=".52906mm">
                 <v:stroke endarrow="open" joinstyle="miter"/>
               </v:shape>
             </w:pict>
@@ -2552,7 +2552,7 @@
           </mc:Choice>
           <mc:Fallback>
             <w:pict>
-              <v:rect w14:anchorId="78C5CF5F" id="Rectangle 1" o:spid="_x0000_s1026" style="position:absolute;margin-left:117.65pt;margin-top:7.3pt;width:257.5pt;height:414pt;z-index:251659264;visibility:visible;mso-wrap-style:square;mso-wrap-distance-left:9pt;mso-wrap-distance-top:0;mso-wrap-distance-right:9pt;mso-wrap-distance-bottom:0;mso-position-horizontal:absolute;mso-position-horizontal-relative:text;mso-position-vertical:absolute;mso-position-vertical-relative:text;v-text-anchor:top" o:gfxdata="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" strokecolor="#a02b93" strokeweight=".35281mm">
+              <v:rect w14:anchorId="4291241A" id="Rectangle 1" o:spid="_x0000_s1026" style="position:absolute;margin-left:117.65pt;margin-top:7.3pt;width:257.5pt;height:414pt;z-index:251659264;visibility:visible;mso-wrap-style:square;mso-wrap-distance-left:9pt;mso-wrap-distance-top:0;mso-wrap-distance-right:9pt;mso-wrap-distance-bottom:0;mso-position-horizontal:absolute;mso-position-horizontal-relative:text;mso-position-vertical:absolute;mso-position-vertical-relative:text;v-text-anchor:top" o:gfxdata="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" strokecolor="#a02b93" strokeweight=".35281mm">
                 <v:textbox inset="0,0,0,0"/>
               </v:rect>
             </w:pict>
@@ -2615,7 +2615,7 @@
           </mc:Choice>
           <mc:Fallback>
             <w:pict>
-              <v:shape w14:anchorId="6B0C9B18" id="Straight Arrow Connector 7" o:spid="_x0000_s1026" type="#_x0000_t32" style="position:absolute;margin-left:36.8pt;margin-top:52.95pt;width:117.3pt;height:99.6pt;z-index:251684864;visibility:visible;mso-wrap-style:square;mso-wrap-distance-left:9pt;mso-wrap-distance-top:0;mso-wrap-distance-right:9pt;mso-wrap-distance-bottom:0;mso-position-horizontal:absolute;mso-position-horizontal-relative:text;mso-position-vertical:absolute;mso-position-vertical-relative:text" o:gfxdata="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" strokeweight=".52906mm">
+              <v:shape w14:anchorId="6DC29333" id="Straight Arrow Connector 7" o:spid="_x0000_s1026" type="#_x0000_t32" style="position:absolute;margin-left:36.8pt;margin-top:52.95pt;width:117.3pt;height:99.6pt;z-index:251684864;visibility:visible;mso-wrap-style:square;mso-wrap-distance-left:9pt;mso-wrap-distance-top:0;mso-wrap-distance-right:9pt;mso-wrap-distance-bottom:0;mso-position-horizontal:absolute;mso-position-horizontal-relative:text;mso-position-vertical:absolute;mso-position-vertical-relative:text" o:gfxdata="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" strokeweight=".52906mm">
                 <v:stroke endarrow="open" joinstyle="miter"/>
               </v:shape>
             </w:pict>
@@ -2898,7 +2898,7 @@
           </mc:Choice>
           <mc:Fallback>
             <w:pict>
-              <v:shape w14:anchorId="2B9CA827" id="Straight Arrow Connector 7" o:spid="_x0000_s1026" type="#_x0000_t32" style="position:absolute;margin-left:35.2pt;margin-top:52.95pt;width:120.6pt;height:22.85pt;z-index:251672576;visibility:visible;mso-wrap-style:square;mso-wrap-distance-left:9pt;mso-wrap-distance-top:0;mso-wrap-distance-right:9pt;mso-wrap-distance-bottom:0;mso-position-horizontal:absolute;mso-position-horizontal-relative:text;mso-position-vertical:absolute;mso-position-vertical-relative:text" o:gfxdata="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" strokeweight=".52906mm">
+              <v:shape w14:anchorId="231E6477" id="Straight Arrow Connector 7" o:spid="_x0000_s1026" type="#_x0000_t32" style="position:absolute;margin-left:35.2pt;margin-top:52.95pt;width:120.6pt;height:22.85pt;z-index:251672576;visibility:visible;mso-wrap-style:square;mso-wrap-distance-left:9pt;mso-wrap-distance-top:0;mso-wrap-distance-right:9pt;mso-wrap-distance-bottom:0;mso-position-horizontal:absolute;mso-position-horizontal-relative:text;mso-position-vertical:absolute;mso-position-vertical-relative:text" o:gfxdata="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" strokeweight=".52906mm">
                 <v:stroke endarrow="open" joinstyle="miter"/>
               </v:shape>
             </w:pict>
@@ -2961,7 +2961,7 @@
           </mc:Choice>
           <mc:Fallback>
             <w:pict>
-              <v:shape w14:anchorId="3B9C6FE6" id="Straight Arrow Connector 7" o:spid="_x0000_s1026" type="#_x0000_t32" style="position:absolute;margin-left:35.2pt;margin-top:52.95pt;width:119pt;height:59.2pt;z-index:251674624;visibility:visible;mso-wrap-style:square;mso-wrap-distance-left:9pt;mso-wrap-distance-top:0;mso-wrap-distance-right:9pt;mso-wrap-distance-bottom:0;mso-position-horizontal:absolute;mso-position-horizontal-relative:text;mso-position-vertical:absolute;mso-position-vertical-relative:text" o:gfxdata="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" strokeweight=".52906mm">
+              <v:shape w14:anchorId="7B2A02EA" id="Straight Arrow Connector 7" o:spid="_x0000_s1026" type="#_x0000_t32" style="position:absolute;margin-left:35.2pt;margin-top:52.95pt;width:119pt;height:59.2pt;z-index:251674624;visibility:visible;mso-wrap-style:square;mso-wrap-distance-left:9pt;mso-wrap-distance-top:0;mso-wrap-distance-right:9pt;mso-wrap-distance-bottom:0;mso-position-horizontal:absolute;mso-position-horizontal-relative:text;mso-position-vertical:absolute;mso-position-vertical-relative:text" o:gfxdata="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" strokeweight=".52906mm">
                 <v:stroke endarrow="open" joinstyle="miter"/>
               </v:shape>
             </w:pict>
@@ -3368,7 +3368,7 @@
           </mc:Choice>
           <mc:Fallback>
             <w:pict>
-              <v:shape w14:anchorId="3C45EE32" id="Straight Arrow Connector 7" o:spid="_x0000_s1026" type="#_x0000_t32" style="position:absolute;margin-left:35.3pt;margin-top:38.1pt;width:119pt;height:13.15pt;flip:y;z-index:251670528;visibility:visible;mso-wrap-style:square;mso-wrap-distance-left:9pt;mso-wrap-distance-top:0;mso-wrap-distance-right:9pt;mso-wrap-distance-bottom:0;mso-position-horizontal:absolute;mso-position-horizontal-relative:text;mso-position-vertical:absolute;mso-position-vertical-relative:text" o:gfxdata="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" strokeweight=".52906mm">
+              <v:shape w14:anchorId="2D8C4A03" id="Straight Arrow Connector 7" o:spid="_x0000_s1026" type="#_x0000_t32" style="position:absolute;margin-left:35.3pt;margin-top:38.1pt;width:119pt;height:13.15pt;flip:y;z-index:251670528;visibility:visible;mso-wrap-style:square;mso-wrap-distance-left:9pt;mso-wrap-distance-top:0;mso-wrap-distance-right:9pt;mso-wrap-distance-bottom:0;mso-position-horizontal:absolute;mso-position-horizontal-relative:text;mso-position-vertical:absolute;mso-position-vertical-relative:text" o:gfxdata="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" strokeweight=".52906mm">
                 <v:stroke endarrow="open" joinstyle="miter"/>
               </v:shape>
             </w:pict>
@@ -3707,7 +3707,7 @@
           </mc:Choice>
           <mc:Fallback>
             <w:pict>
-              <v:shape w14:anchorId="3C1A7B97" id="Straight Arrow Connector 7" o:spid="_x0000_s1026" type="#_x0000_t32" style="position:absolute;margin-left:330.65pt;margin-top:21.55pt;width:109.65pt;height:80.35pt;flip:x;z-index:251695104;visibility:visible;mso-wrap-style:square;mso-wrap-distance-left:9pt;mso-wrap-distance-top:0;mso-wrap-distance-right:9pt;mso-wrap-distance-bottom:0;mso-position-horizontal:absolute;mso-position-horizontal-relative:text;mso-position-vertical:absolute;mso-position-vertical-relative:text" o:gfxdata="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" strokeweight=".52906mm">
+              <v:shape w14:anchorId="0333E82F" id="Straight Arrow Connector 7" o:spid="_x0000_s1026" type="#_x0000_t32" style="position:absolute;margin-left:330.65pt;margin-top:21.55pt;width:109.65pt;height:80.35pt;flip:x;z-index:251695104;visibility:visible;mso-wrap-style:square;mso-wrap-distance-left:9pt;mso-wrap-distance-top:0;mso-wrap-distance-right:9pt;mso-wrap-distance-bottom:0;mso-position-horizontal:absolute;mso-position-horizontal-relative:text;mso-position-vertical:absolute;mso-position-vertical-relative:text" o:gfxdata="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" strokeweight=".52906mm">
                 <v:stroke endarrow="open" joinstyle="miter"/>
               </v:shape>
             </w:pict>
@@ -3770,7 +3770,7 @@
           </mc:Choice>
           <mc:Fallback>
             <w:pict>
-              <v:shape w14:anchorId="03353160" id="Straight Arrow Connector 7" o:spid="_x0000_s1026" type="#_x0000_t32" style="position:absolute;margin-left:330.65pt;margin-top:7.45pt;width:106.3pt;height:52.65pt;flip:x;z-index:251693056;visibility:visible;mso-wrap-style:square;mso-wrap-distance-left:9pt;mso-wrap-distance-top:0;mso-wrap-distance-right:9pt;mso-wrap-distance-bottom:0;mso-position-horizontal:absolute;mso-position-horizontal-relative:text;mso-position-vertical:absolute;mso-position-vertical-relative:text" o:gfxdata="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" strokeweight=".52906mm">
+              <v:shape w14:anchorId="03BFE02D" id="Straight Arrow Connector 7" o:spid="_x0000_s1026" type="#_x0000_t32" style="position:absolute;margin-left:330.65pt;margin-top:7.45pt;width:106.3pt;height:52.65pt;flip:x;z-index:251693056;visibility:visible;mso-wrap-style:square;mso-wrap-distance-left:9pt;mso-wrap-distance-top:0;mso-wrap-distance-right:9pt;mso-wrap-distance-bottom:0;mso-position-horizontal:absolute;mso-position-horizontal-relative:text;mso-position-vertical:absolute;mso-position-vertical-relative:text" o:gfxdata="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" strokeweight=".52906mm">
                 <v:stroke endarrow="open" joinstyle="miter"/>
               </v:shape>
             </w:pict>
@@ -9429,7 +9429,7 @@
       </w:pPr>
       <w:r>
         <w:pict w14:anchorId="5FDF9C4F">
-          <v:shape id="Picture 1" o:spid="_x0000_i1025" type="#_x0000_t75" style="width:23.5pt;height:16pt;visibility:visible;mso-wrap-style:square">
+          <v:shape id="Picture 1" o:spid="_x0000_i1025" type="#_x0000_t75" style="width:23.45pt;height:15.95pt;visibility:visible;mso-wrap-style:square">
             <v:imagedata r:id="rId34" o:title=""/>
           </v:shape>
         </w:pict>
@@ -29248,6 +29248,7 @@
       <w:r>
         <w:rPr>
           <w:rFonts w:ascii="David" w:hAnsi="David" w:cs="David"/>
+          <w:noProof/>
           <w:sz w:val="36"/>
           <w:szCs w:val="36"/>
           <w:lang w:val="en-US"/>
@@ -29319,6 +29320,7 @@
       <w:r>
         <w:rPr>
           <w:rFonts w:ascii="David" w:hAnsi="David" w:cs="David"/>
+          <w:noProof/>
           <w:sz w:val="36"/>
           <w:szCs w:val="36"/>
           <w:lang w:val="en-US"/>
@@ -29597,6 +29599,34 @@
           <w:rFonts w:ascii="David" w:hAnsi="David" w:cs="David"/>
           <w:sz w:val="36"/>
           <w:szCs w:val="36"/>
+          <w:lang w:val="en-US"/>
+        </w:rPr>
+        <w:t xml:space="preserve"> </w:t>
+      </w:r>
+      <w:r>
+        <w:rPr>
+          <w:rFonts w:ascii="David" w:hAnsi="David" w:cs="David" w:hint="cs"/>
+          <w:sz w:val="36"/>
+          <w:szCs w:val="36"/>
+          <w:rtl/>
+          <w:lang w:val="en-US"/>
+        </w:rPr>
+        <w:t xml:space="preserve"> או </w:t>
+      </w:r>
+      <w:r>
+        <w:rPr>
+          <w:rFonts w:ascii="David" w:hAnsi="David" w:cs="David"/>
+          <w:sz w:val="36"/>
+          <w:szCs w:val="36"/>
+          <w:lang w:val="en-US"/>
+        </w:rPr>
+        <w:t>TrackMong1</w:t>
+      </w:r>
+      <w:r>
+        <w:rPr>
+          <w:rFonts w:ascii="David" w:hAnsi="David" w:cs="David"/>
+          <w:sz w:val="36"/>
+          <w:szCs w:val="36"/>
           <w:rtl/>
           <w:lang w:val="en-US"/>
         </w:rPr>
@@ -29698,6 +29728,14 @@
           <w:lang w:val="en-US"/>
         </w:rPr>
       </w:pPr>
+      <w:r>
+        <w:rPr>
+          <w:sz w:val="24"/>
+          <w:szCs w:val="24"/>
+          <w:lang w:val="en-US"/>
+        </w:rPr>
+        <w:t>////</w:t>
+      </w:r>
     </w:p>
     <w:p>
       <w:pPr>
@@ -29912,7 +29950,7 @@
           </mc:Choice>
           <mc:Fallback>
             <w:pict>
-              <v:line w14:anchorId="4CF3D0D2" id="מחבר ישר 7" o:spid="_x0000_s1026" style="position:absolute;flip:x;z-index:251714560;visibility:visible;mso-wrap-style:square;mso-width-percent:0;mso-height-percent:0;mso-wrap-distance-left:9pt;mso-wrap-distance-top:0;mso-wrap-distance-right:9pt;mso-wrap-distance-bottom:0;mso-position-horizontal:absolute;mso-position-horizontal-relative:text;mso-position-vertical:absolute;mso-position-vertical-relative:text;mso-width-percent:0;mso-height-percent:0;mso-width-relative:margin;mso-height-relative:margin" from="163.8pt,63.4pt" to="163.8pt,84.45pt" o:gfxdata="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" strokecolor="#156082 [3204]" strokeweight=".5pt">
+              <v:line w14:anchorId="60BD72A4" id="מחבר ישר 7" o:spid="_x0000_s1026" style="position:absolute;flip:x;z-index:251714560;visibility:visible;mso-wrap-style:square;mso-width-percent:0;mso-height-percent:0;mso-wrap-distance-left:9pt;mso-wrap-distance-top:0;mso-wrap-distance-right:9pt;mso-wrap-distance-bottom:0;mso-position-horizontal:absolute;mso-position-horizontal-relative:text;mso-position-vertical:absolute;mso-position-vertical-relative:text;mso-width-percent:0;mso-height-percent:0;mso-width-relative:margin;mso-height-relative:margin" from="163.8pt,63.4pt" to="163.8pt,84.45pt" o:gfxdata="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" strokecolor="#156082 [3204]" strokeweight=".5pt">
                 <v:stroke joinstyle="miter"/>
               </v:line>
             </w:pict>
@@ -29985,7 +30023,7 @@
           </mc:Choice>
           <mc:Fallback>
             <w:pict>
-              <v:line w14:anchorId="62F1CDB3" id="מחבר ישר 6" o:spid="_x0000_s1026" style="position:absolute;z-index:251712512;visibility:visible;mso-wrap-style:square;mso-width-percent:0;mso-height-percent:0;mso-wrap-distance-left:9pt;mso-wrap-distance-top:0;mso-wrap-distance-right:9pt;mso-wrap-distance-bottom:0;mso-position-horizontal:absolute;mso-position-horizontal-relative:text;mso-position-vertical:absolute;mso-position-vertical-relative:text;mso-width-percent:0;mso-height-percent:0;mso-width-relative:margin;mso-height-relative:margin" from="275.85pt,63.05pt" to="275.85pt,83.45pt" o:gfxdata="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" strokecolor="#156082 [3204]" strokeweight=".5pt">
+              <v:line w14:anchorId="1B165F09" id="מחבר ישר 6" o:spid="_x0000_s1026" style="position:absolute;z-index:251712512;visibility:visible;mso-wrap-style:square;mso-width-percent:0;mso-height-percent:0;mso-wrap-distance-left:9pt;mso-wrap-distance-top:0;mso-wrap-distance-right:9pt;mso-wrap-distance-bottom:0;mso-position-horizontal:absolute;mso-position-horizontal-relative:text;mso-position-vertical:absolute;mso-position-vertical-relative:text;mso-width-percent:0;mso-height-percent:0;mso-width-relative:margin;mso-height-relative:margin" from="275.85pt,63.05pt" to="275.85pt,83.45pt" o:gfxdata="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" strokecolor="#156082 [3204]" strokeweight=".5pt">
                 <v:stroke joinstyle="miter"/>
               </v:line>
             </w:pict>
@@ -30288,7 +30326,7 @@
           </mc:Choice>
           <mc:Fallback>
             <w:pict>
-              <v:line w14:anchorId="39C673A8" id="מחבר ישר 3" o:spid="_x0000_s1026" style="position:absolute;z-index:251708416;visibility:visible;mso-wrap-style:square;mso-wrap-distance-left:9pt;mso-wrap-distance-top:0;mso-wrap-distance-right:9pt;mso-wrap-distance-bottom:0;mso-position-horizontal:absolute;mso-position-horizontal-relative:text;mso-position-vertical:absolute;mso-position-vertical-relative:text" from="163.9pt,63.15pt" to="276.1pt,63.15pt" o:gfxdata="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" strokecolor="#156082 [3204]" strokeweight=".5pt">
+              <v:line w14:anchorId="07299154" id="מחבר ישר 3" o:spid="_x0000_s1026" style="position:absolute;z-index:251708416;visibility:visible;mso-wrap-style:square;mso-wrap-distance-left:9pt;mso-wrap-distance-top:0;mso-wrap-distance-right:9pt;mso-wrap-distance-bottom:0;mso-position-horizontal:absolute;mso-position-horizontal-relative:text;mso-position-vertical:absolute;mso-position-vertical-relative:text" from="163.9pt,63.15pt" to="276.1pt,63.15pt" o:gfxdata="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" strokecolor="#156082 [3204]" strokeweight=".5pt">
                 <v:stroke joinstyle="miter"/>
               </v:line>
             </w:pict>
@@ -30358,7 +30396,7 @@
           </mc:Choice>
           <mc:Fallback>
             <w:pict>
-              <v:shape w14:anchorId="41861E6D" id="מחבר חץ ישר 2" o:spid="_x0000_s1026" type="#_x0000_t32" style="position:absolute;margin-left:218.65pt;margin-top:15pt;width:.45pt;height:49.95pt;flip:y;z-index:251707392;visibility:visible;mso-wrap-style:square;mso-wrap-distance-left:9pt;mso-wrap-distance-top:0;mso-wrap-distance-right:9pt;mso-wrap-distance-bottom:0;mso-position-horizontal:absolute;mso-position-horizontal-relative:text;mso-position-vertical:absolute;mso-position-vertical-relative:text" o:gfxdata="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" strokecolor="#156082 [3204]" strokeweight=".5pt">
+              <v:shape w14:anchorId="5AA916B5" id="מחבר חץ ישר 2" o:spid="_x0000_s1026" type="#_x0000_t32" style="position:absolute;margin-left:218.65pt;margin-top:15pt;width:.45pt;height:49.95pt;flip:y;z-index:251707392;visibility:visible;mso-wrap-style:square;mso-wrap-distance-left:9pt;mso-wrap-distance-top:0;mso-wrap-distance-right:9pt;mso-wrap-distance-bottom:0;mso-position-horizontal:absolute;mso-position-horizontal-relative:text;mso-position-vertical:absolute;mso-position-vertical-relative:text" o:gfxdata="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" strokecolor="#156082 [3204]" strokeweight=".5pt">
                 <v:stroke endarrow="block" joinstyle="miter"/>
               </v:shape>
             </w:pict>
@@ -31237,7 +31275,7 @@
           </mc:Choice>
           <mc:Fallback>
             <w:pict>
-              <v:line w14:anchorId="500BF357" id="Straight Connector 43" o:spid="_x0000_s1026" style="position:absolute;flip:y;z-index:251749376;visibility:visible;mso-wrap-style:square;mso-width-percent:0;mso-height-percent:0;mso-wrap-distance-left:9pt;mso-wrap-distance-top:0;mso-wrap-distance-right:9pt;mso-wrap-distance-bottom:0;mso-position-horizontal:absolute;mso-position-horizontal-relative:text;mso-position-vertical:absolute;mso-position-vertical-relative:text;mso-width-percent:0;mso-height-percent:0;mso-width-relative:margin;mso-height-relative:margin" from="18.05pt,48.55pt" to="135.05pt,48.65pt" o:gfxdata="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" strokecolor="#e97132 [3205]">
+              <v:line w14:anchorId="2CD95902" id="Straight Connector 43" o:spid="_x0000_s1026" style="position:absolute;flip:y;z-index:251749376;visibility:visible;mso-wrap-style:square;mso-width-percent:0;mso-height-percent:0;mso-wrap-distance-left:9pt;mso-wrap-distance-top:0;mso-wrap-distance-right:9pt;mso-wrap-distance-bottom:0;mso-position-horizontal:absolute;mso-position-horizontal-relative:text;mso-position-vertical:absolute;mso-position-vertical-relative:text;mso-width-percent:0;mso-height-percent:0;mso-width-relative:margin;mso-height-relative:margin" from="18.05pt,48.55pt" to="135.05pt,48.65pt" o:gfxdata="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" strokecolor="#e97132 [3205]">
                 <v:stroke dashstyle="dash"/>
               </v:line>
             </w:pict>
@@ -31320,7 +31358,7 @@
           </mc:Choice>
           <mc:Fallback>
             <w:pict>
-              <v:line w14:anchorId="460FE233" id="Straight Connector 43" o:spid="_x0000_s1026" style="position:absolute;z-index:251745280;visibility:visible;mso-wrap-style:square;mso-width-percent:0;mso-height-percent:0;mso-wrap-distance-left:9pt;mso-wrap-distance-top:0;mso-wrap-distance-right:9pt;mso-wrap-distance-bottom:0;mso-position-horizontal:absolute;mso-position-horizontal-relative:text;mso-position-vertical:absolute;mso-position-vertical-relative:text;mso-width-percent:0;mso-height-percent:0;mso-width-relative:margin;mso-height-relative:margin" from="18pt,49.7pt" to="18.05pt,175.7pt" o:gfxdata="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" strokecolor="#e97132 [3205]">
+              <v:line w14:anchorId="4D7026D7" id="Straight Connector 43" o:spid="_x0000_s1026" style="position:absolute;z-index:251745280;visibility:visible;mso-wrap-style:square;mso-width-percent:0;mso-height-percent:0;mso-wrap-distance-left:9pt;mso-wrap-distance-top:0;mso-wrap-distance-right:9pt;mso-wrap-distance-bottom:0;mso-position-horizontal:absolute;mso-position-horizontal-relative:text;mso-position-vertical:absolute;mso-position-vertical-relative:text;mso-width-percent:0;mso-height-percent:0;mso-width-relative:margin;mso-height-relative:margin" from="18pt,49.7pt" to="18.05pt,175.7pt" o:gfxdata="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" strokecolor="#e97132 [3205]">
                 <v:stroke dashstyle="dash"/>
               </v:line>
             </w:pict>
@@ -31403,7 +31441,7 @@
           </mc:Choice>
           <mc:Fallback>
             <w:pict>
-              <v:line w14:anchorId="13555639" id="Straight Connector 43" o:spid="_x0000_s1026" style="position:absolute;flip:x;z-index:251743232;visibility:visible;mso-wrap-style:square;mso-width-percent:0;mso-height-percent:0;mso-wrap-distance-left:9pt;mso-wrap-distance-top:0;mso-wrap-distance-right:9pt;mso-wrap-distance-bottom:0;mso-position-horizontal:absolute;mso-position-horizontal-relative:text;mso-position-vertical:absolute;mso-position-vertical-relative:text;mso-width-percent:0;mso-height-percent:0;mso-width-relative:margin;mso-height-relative:margin" from="134.9pt,49.7pt" to="135pt,175.7pt" o:gfxdata="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" strokecolor="#e97132 [3205]">
+              <v:line w14:anchorId="75396C01" id="Straight Connector 43" o:spid="_x0000_s1026" style="position:absolute;flip:x;z-index:251743232;visibility:visible;mso-wrap-style:square;mso-width-percent:0;mso-height-percent:0;mso-wrap-distance-left:9pt;mso-wrap-distance-top:0;mso-wrap-distance-right:9pt;mso-wrap-distance-bottom:0;mso-position-horizontal:absolute;mso-position-horizontal-relative:text;mso-position-vertical:absolute;mso-position-vertical-relative:text;mso-width-percent:0;mso-height-percent:0;mso-width-relative:margin;mso-height-relative:margin" from="134.9pt,49.7pt" to="135pt,175.7pt" o:gfxdata="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" strokecolor="#e97132 [3205]">
                 <v:stroke dashstyle="dash"/>
               </v:line>
             </w:pict>
@@ -31486,7 +31524,7 @@
           </mc:Choice>
           <mc:Fallback>
             <w:pict>
-              <v:line w14:anchorId="01006B1F" id="Straight Connector 43" o:spid="_x0000_s1026" style="position:absolute;flip:x y;z-index:251758592;visibility:visible;mso-wrap-style:square;mso-width-percent:0;mso-height-percent:0;mso-wrap-distance-left:9pt;mso-wrap-distance-top:0;mso-wrap-distance-right:9pt;mso-wrap-distance-bottom:0;mso-position-horizontal:absolute;mso-position-horizontal-relative:text;mso-position-vertical:absolute;mso-position-vertical-relative:text;mso-width-percent:0;mso-height-percent:0;mso-width-relative:margin;mso-height-relative:margin" from="269.95pt,13.7pt" to="270pt,58.65pt" o:gfxdata="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" strokecolor="#e97132 [3205]">
+              <v:line w14:anchorId="0F667701" id="Straight Connector 43" o:spid="_x0000_s1026" style="position:absolute;flip:x y;z-index:251758592;visibility:visible;mso-wrap-style:square;mso-width-percent:0;mso-height-percent:0;mso-wrap-distance-left:9pt;mso-wrap-distance-top:0;mso-wrap-distance-right:9pt;mso-wrap-distance-bottom:0;mso-position-horizontal:absolute;mso-position-horizontal-relative:text;mso-position-vertical:absolute;mso-position-vertical-relative:text;mso-width-percent:0;mso-height-percent:0;mso-width-relative:margin;mso-height-relative:margin" from="269.95pt,13.7pt" to="270pt,58.65pt" o:gfxdata="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" strokecolor="#e97132 [3205]">
                 <v:stroke dashstyle="dash"/>
               </v:line>
             </w:pict>
@@ -31569,7 +31607,7 @@
           </mc:Choice>
           <mc:Fallback>
             <w:pict>
-              <v:line w14:anchorId="7884FA46" id="Straight Connector 43" o:spid="_x0000_s1026" style="position:absolute;flip:y;z-index:251756544;visibility:visible;mso-wrap-style:square;mso-width-percent:0;mso-height-percent:0;mso-wrap-distance-left:9pt;mso-wrap-distance-top:0;mso-wrap-distance-right:9pt;mso-wrap-distance-bottom:0;mso-position-horizontal:absolute;mso-position-horizontal-relative:text;mso-position-vertical:absolute;mso-position-vertical-relative:text;mso-width-percent:0;mso-height-percent:0;mso-width-relative:margin;mso-height-relative:margin" from="152.9pt,14.4pt" to="152.9pt,58.65pt" o:gfxdata="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" strokecolor="#e97132 [3205]">
+              <v:line w14:anchorId="134F7816" id="Straight Connector 43" o:spid="_x0000_s1026" style="position:absolute;flip:y;z-index:251756544;visibility:visible;mso-wrap-style:square;mso-width-percent:0;mso-height-percent:0;mso-wrap-distance-left:9pt;mso-wrap-distance-top:0;mso-wrap-distance-right:9pt;mso-wrap-distance-bottom:0;mso-position-horizontal:absolute;mso-position-horizontal-relative:text;mso-position-vertical:absolute;mso-position-vertical-relative:text;mso-width-percent:0;mso-height-percent:0;mso-width-relative:margin;mso-height-relative:margin" from="152.9pt,14.4pt" to="152.9pt,58.65pt" o:gfxdata="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" strokecolor="#e97132 [3205]">
                 <v:stroke dashstyle="dash"/>
               </v:line>
             </w:pict>
@@ -31652,7 +31690,7 @@
           </mc:Choice>
           <mc:Fallback>
             <w:pict>
-              <v:line w14:anchorId="46263461" id="Straight Connector 43" o:spid="_x0000_s1026" style="position:absolute;flip:y;z-index:251754496;visibility:visible;mso-wrap-style:square;mso-width-percent:0;mso-height-percent:0;mso-wrap-distance-left:9pt;mso-wrap-distance-top:0;mso-wrap-distance-right:9pt;mso-wrap-distance-bottom:0;mso-position-horizontal:absolute;mso-position-horizontal-relative:text;mso-position-vertical:absolute;mso-position-vertical-relative:text;mso-width-percent:0;mso-height-percent:0;mso-width-relative:margin;mso-height-relative:margin" from="153pt,58.1pt" to="270pt,58.2pt" o:gfxdata="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" strokecolor="#e97132 [3205]">
+              <v:line w14:anchorId="3FF0D135" id="Straight Connector 43" o:spid="_x0000_s1026" style="position:absolute;flip:y;z-index:251754496;visibility:visible;mso-wrap-style:square;mso-width-percent:0;mso-height-percent:0;mso-wrap-distance-left:9pt;mso-wrap-distance-top:0;mso-wrap-distance-right:9pt;mso-wrap-distance-bottom:0;mso-position-horizontal:absolute;mso-position-horizontal-relative:text;mso-position-vertical:absolute;mso-position-vertical-relative:text;mso-width-percent:0;mso-height-percent:0;mso-width-relative:margin;mso-height-relative:margin" from="153pt,58.1pt" to="270pt,58.2pt" o:gfxdata="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" strokecolor="#e97132 [3205]">
                 <v:stroke dashstyle="dash"/>
               </v:line>
             </w:pict>
@@ -31735,7 +31773,7 @@
           </mc:Choice>
           <mc:Fallback>
             <w:pict>
-              <v:line w14:anchorId="278E3010" id="Straight Connector 43" o:spid="_x0000_s1026" style="position:absolute;flip:y;z-index:251752448;visibility:visible;mso-wrap-style:square;mso-width-percent:0;mso-height-percent:0;mso-wrap-distance-left:9pt;mso-wrap-distance-top:0;mso-wrap-distance-right:9pt;mso-wrap-distance-bottom:0;mso-position-horizontal:absolute;mso-position-horizontal-relative:text;mso-position-vertical:absolute;mso-position-vertical-relative:text;mso-width-percent:0;mso-height-percent:0;mso-width-relative:margin;mso-height-relative:margin" from="153pt,13.7pt" to="270pt,13.8pt" o:gfxdata="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" strokecolor="#e97132 [3205]">
+              <v:line w14:anchorId="16FB77F8" id="Straight Connector 43" o:spid="_x0000_s1026" style="position:absolute;flip:y;z-index:251752448;visibility:visible;mso-wrap-style:square;mso-width-percent:0;mso-height-percent:0;mso-wrap-distance-left:9pt;mso-wrap-distance-top:0;mso-wrap-distance-right:9pt;mso-wrap-distance-bottom:0;mso-position-horizontal:absolute;mso-position-horizontal-relative:text;mso-position-vertical:absolute;mso-position-vertical-relative:text;mso-width-percent:0;mso-height-percent:0;mso-width-relative:margin;mso-height-relative:margin" from="153pt,13.7pt" to="270pt,13.8pt" o:gfxdata="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" strokecolor="#e97132 [3205]">
                 <v:stroke dashstyle="dash"/>
               </v:line>
             </w:pict>
@@ -31932,7 +31970,7 @@
           </mc:Choice>
           <mc:Fallback>
             <w:pict>
-              <v:shape w14:anchorId="28A17A8D" id="Straight Arrow Connector 33" o:spid="_x0000_s1026" type="#_x0000_t32" style="position:absolute;margin-left:261pt;margin-top:31.7pt;width:18pt;height:0;z-index:251734016;visibility:visible;mso-wrap-style:square;mso-wrap-distance-left:9pt;mso-wrap-distance-top:0;mso-wrap-distance-right:9pt;mso-wrap-distance-bottom:0;mso-position-horizontal:absolute;mso-position-horizontal-relative:text;mso-position-vertical:absolute;mso-position-vertical-relative:text" o:gfxdata="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" strokecolor="#156082 [3204]" strokeweight=".5pt">
+              <v:shape w14:anchorId="0EE2BAFC" id="Straight Arrow Connector 33" o:spid="_x0000_s1026" type="#_x0000_t32" style="position:absolute;margin-left:261pt;margin-top:31.7pt;width:18pt;height:0;z-index:251734016;visibility:visible;mso-wrap-style:square;mso-wrap-distance-left:9pt;mso-wrap-distance-top:0;mso-wrap-distance-right:9pt;mso-wrap-distance-bottom:0;mso-position-horizontal:absolute;mso-position-horizontal-relative:text;mso-position-vertical:absolute;mso-position-vertical-relative:text" o:gfxdata="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" strokecolor="#156082 [3204]" strokeweight=".5pt">
                 <v:stroke endarrow="block" joinstyle="miter"/>
               </v:shape>
             </w:pict>
@@ -32129,7 +32167,7 @@
           </mc:Choice>
           <mc:Fallback>
             <w:pict>
-              <v:shapetype w14:anchorId="16F6F7F6" id="_x0000_t38" coordsize="21600,21600" o:spt="38" o:oned="t" path="m,c@0,0@1,5400@1,10800@1,16200@2,21600,21600,21600e" filled="f">
+              <v:shapetype w14:anchorId="021E362D" id="_x0000_t38" coordsize="21600,21600" o:spt="38" o:oned="t" path="m,c@0,0@1,5400@1,10800@1,16200@2,21600,21600,21600e" filled="f">
                 <v:formulas>
                   <v:f eqn="mid #0 0"/>
                   <v:f eqn="val #0"/>
@@ -32215,7 +32253,7 @@
           </mc:Choice>
           <mc:Fallback>
             <w:pict>
-              <v:shape w14:anchorId="2339B335" id="Connector: Curved 31" o:spid="_x0000_s1026" type="#_x0000_t38" style="position:absolute;margin-left:126pt;margin-top:22.7pt;width:45pt;height:1in;flip:y;z-index:251726848;visibility:visible;mso-wrap-style:square;mso-height-percent:0;mso-wrap-distance-left:9pt;mso-wrap-distance-top:0;mso-wrap-distance-right:9pt;mso-wrap-distance-bottom:0;mso-position-horizontal:absolute;mso-position-horizontal-relative:text;mso-position-vertical:absolute;mso-position-vertical-relative:text;mso-height-percent:0;mso-height-relative:margin" o:gfxdata="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" adj="10800" strokecolor="#156082 [3204]" strokeweight=".5pt">
+              <v:shape w14:anchorId="4E251513" id="Connector: Curved 31" o:spid="_x0000_s1026" type="#_x0000_t38" style="position:absolute;margin-left:126pt;margin-top:22.7pt;width:45pt;height:1in;flip:y;z-index:251726848;visibility:visible;mso-wrap-style:square;mso-height-percent:0;mso-wrap-distance-left:9pt;mso-wrap-distance-top:0;mso-wrap-distance-right:9pt;mso-wrap-distance-bottom:0;mso-position-horizontal:absolute;mso-position-horizontal-relative:text;mso-position-vertical:absolute;mso-position-vertical-relative:text;mso-height-percent:0;mso-height-relative:margin" o:gfxdata="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" adj="10800" strokecolor="#156082 [3204]" strokeweight=".5pt">
                 <v:stroke endarrow="block" joinstyle="miter"/>
               </v:shape>
             </w:pict>
@@ -32607,7 +32645,7 @@
           </mc:Choice>
           <mc:Fallback>
             <w:pict>
-              <v:line w14:anchorId="1BB5CB25" id="Straight Connector 43" o:spid="_x0000_s1026" style="position:absolute;flip:x y;z-index:251747328;visibility:visible;mso-wrap-style:square;mso-width-percent:0;mso-height-percent:0;mso-wrap-distance-left:9pt;mso-wrap-distance-top:0;mso-wrap-distance-right:9pt;mso-wrap-distance-bottom:0;mso-position-horizontal:absolute;mso-position-horizontal-relative:text;mso-position-vertical:absolute;mso-position-vertical-relative:text;mso-width-percent:0;mso-height-percent:0;mso-width-relative:margin;mso-height-relative:margin" from="18pt,73.95pt" to="134.95pt,74pt" o:gfxdata="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" strokecolor="#e97132 [3205]">
+              <v:line w14:anchorId="32832BEE" id="Straight Connector 43" o:spid="_x0000_s1026" style="position:absolute;flip:x y;z-index:251747328;visibility:visible;mso-wrap-style:square;mso-width-percent:0;mso-height-percent:0;mso-wrap-distance-left:9pt;mso-wrap-distance-top:0;mso-wrap-distance-right:9pt;mso-wrap-distance-bottom:0;mso-position-horizontal:absolute;mso-position-horizontal-relative:text;mso-position-vertical:absolute;mso-position-vertical-relative:text;mso-width-percent:0;mso-height-percent:0;mso-width-relative:margin;mso-height-relative:margin" from="18pt,73.95pt" to="134.95pt,74pt" o:gfxdata="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" strokecolor="#e97132 [3205]">
                 <v:stroke dashstyle="dash"/>
               </v:line>
             </w:pict>
@@ -33229,52 +33267,6 @@
         </w:rPr>
         <w:t>לפי זמן הפעילות,שם המשתמש שביצע את הפעילות או זמן העלאת הרשומה לענן של מונגו די בי .</w:t>
       </w:r>
-      <w:r>
-        <w:rPr>
-          <w:rFonts w:ascii="David" w:eastAsia="Times New Roman" w:hAnsi="David" w:cs="David"/>
-          <w:color w:val="FF0000"/>
-          <w:sz w:val="28"/>
-          <w:szCs w:val="28"/>
-          <w:rtl/>
-          <w:lang w:val="en-US"/>
-        </w:rPr>
-        <w:t xml:space="preserve">הערה צריך לשנות את השם של </w:t>
-      </w:r>
-      <w:proofErr w:type="spellStart"/>
-      <w:r>
-        <w:rPr>
-          <w:rFonts w:ascii="David" w:hAnsi="David" w:cs="David"/>
-          <w:color w:val="FF0000"/>
-          <w:sz w:val="28"/>
-          <w:szCs w:val="28"/>
-          <w:lang w:val="en-US"/>
-        </w:rPr>
-        <w:t>IsShowAllTasks</w:t>
-      </w:r>
-      <w:proofErr w:type="spellEnd"/>
-      <w:r>
-        <w:rPr>
-          <w:rFonts w:ascii="David" w:hAnsi="David" w:cs="David"/>
-          <w:color w:val="FF0000"/>
-          <w:sz w:val="28"/>
-          <w:szCs w:val="28"/>
-          <w:rtl/>
-          <w:lang w:val="en-US"/>
-        </w:rPr>
-        <w:t xml:space="preserve"> ל</w:t>
-      </w:r>
-      <w:proofErr w:type="spellStart"/>
-      <w:r>
-        <w:rPr>
-          <w:rFonts w:ascii="David" w:hAnsi="David" w:cs="David"/>
-          <w:color w:val="FF0000"/>
-          <w:sz w:val="28"/>
-          <w:szCs w:val="28"/>
-          <w:lang w:val="en-US"/>
-        </w:rPr>
-        <w:t>ShowMyUserRecords</w:t>
-      </w:r>
-      <w:proofErr w:type="spellEnd"/>
     </w:p>
     <w:p>
       <w:pPr>
@@ -33382,7 +33374,7 @@
           </mc:Choice>
           <mc:Fallback>
             <w:pict>
-              <v:rect w14:anchorId="0076EBA6" id="מלבן 9" o:spid="_x0000_s1047" style="position:absolute;left:0;text-align:left;margin-left:188.95pt;margin-top:4.7pt;width:135.05pt;height:32pt;z-index:251769856;visibility:visible;mso-wrap-style:square;mso-width-percent:0;mso-height-percent:0;mso-wrap-distance-left:9pt;mso-wrap-distance-top:0;mso-wrap-distance-right:9pt;mso-wrap-distance-bottom:0;mso-position-horizontal:absolute;mso-position-horizontal-relative:text;mso-position-vertical:absolute;mso-position-vertical-relative:text;mso-width-percent:0;mso-height-percent:0;mso-width-relative:margin;mso-height-relative:margin;v-text-anchor:middle" o:gfxdata="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" fillcolor="white [3201]" strokecolor="black [3200]" strokeweight="1pt">
+              <v:rect w14:anchorId="0076EBA6" id="מלבן 9" o:spid="_x0000_s1047" style="position:absolute;left:0;text-align:left;margin-left:188.95pt;margin-top:4.7pt;width:135.05pt;height:32pt;z-index:251769856;visibility:visible;mso-wrap-style:square;mso-width-percent:0;mso-height-percent:0;mso-wrap-distance-left:9pt;mso-wrap-distance-top:0;mso-wrap-distance-right:9pt;mso-wrap-distance-bottom:0;mso-position-horizontal:absolute;mso-position-horizontal-relative:text;mso-position-vertical:absolute;mso-position-vertical-relative:text;mso-width-percent:0;mso-height-percent:0;mso-width-relative:margin;mso-height-relative:margin;v-text-anchor:middle" o:gfxdata="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" fillcolor="white [3201]" strokecolor="black [3200]" strokeweight="1pt">
                 <v:textbox>
                   <w:txbxContent>
                     <w:p>
@@ -33483,7 +33475,7 @@
           </mc:Choice>
           <mc:Fallback>
             <w:pict>
-              <v:shape w14:anchorId="46E74801" id="מחבר חץ ישר 19" o:spid="_x0000_s1026" type="#_x0000_t32" style="position:absolute;margin-left:126pt;margin-top:135pt;width:62.95pt;height:18.3pt;flip:y;z-index:251786240;visibility:visible;mso-wrap-style:square;mso-wrap-distance-left:9pt;mso-wrap-distance-top:0;mso-wrap-distance-right:9pt;mso-wrap-distance-bottom:0;mso-position-horizontal:absolute;mso-position-horizontal-relative:text;mso-position-vertical:absolute;mso-position-vertical-relative:text" o:gfxdata="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" strokecolor="#156082 [3204]" strokeweight=".5pt">
+              <v:shape w14:anchorId="0087AAE1" id="מחבר חץ ישר 19" o:spid="_x0000_s1026" type="#_x0000_t32" style="position:absolute;margin-left:126pt;margin-top:135pt;width:62.95pt;height:18.3pt;flip:y;z-index:251786240;visibility:visible;mso-wrap-style:square;mso-wrap-distance-left:9pt;mso-wrap-distance-top:0;mso-wrap-distance-right:9pt;mso-wrap-distance-bottom:0;mso-position-horizontal:absolute;mso-position-horizontal-relative:text;mso-position-vertical:absolute;mso-position-vertical-relative:text" o:gfxdata="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" strokecolor="#156082 [3204]" strokeweight=".5pt">
                 <v:stroke endarrow="block" joinstyle="miter"/>
               </v:shape>
             </w:pict>
@@ -33554,7 +33546,7 @@
           </mc:Choice>
           <mc:Fallback>
             <w:pict>
-              <v:shape w14:anchorId="5FB20AC8" id="מחבר חץ ישר 18" o:spid="_x0000_s1026" type="#_x0000_t32" style="position:absolute;margin-left:251.95pt;margin-top:134.1pt;width:0;height:18.9pt;flip:y;z-index:251785216;visibility:visible;mso-wrap-style:square;mso-wrap-distance-left:9pt;mso-wrap-distance-top:0;mso-wrap-distance-right:9pt;mso-wrap-distance-bottom:0;mso-position-horizontal:absolute;mso-position-horizontal-relative:text;mso-position-vertical:absolute;mso-position-vertical-relative:text" o:gfxdata="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" strokecolor="#156082 [3204]" strokeweight=".5pt">
+              <v:shape w14:anchorId="452A4709" id="מחבר חץ ישר 18" o:spid="_x0000_s1026" type="#_x0000_t32" style="position:absolute;margin-left:251.95pt;margin-top:134.1pt;width:0;height:18.9pt;flip:y;z-index:251785216;visibility:visible;mso-wrap-style:square;mso-wrap-distance-left:9pt;mso-wrap-distance-top:0;mso-wrap-distance-right:9pt;mso-wrap-distance-bottom:0;mso-position-horizontal:absolute;mso-position-horizontal-relative:text;mso-position-vertical:absolute;mso-position-vertical-relative:text" o:gfxdata="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" strokecolor="#156082 [3204]" strokeweight=".5pt">
                 <v:stroke endarrow="block" joinstyle="miter"/>
               </v:shape>
             </w:pict>
@@ -33625,7 +33617,7 @@
           </mc:Choice>
           <mc:Fallback>
             <w:pict>
-              <v:shape w14:anchorId="04FEE6B0" id="מחבר חץ ישר 17" o:spid="_x0000_s1026" type="#_x0000_t32" style="position:absolute;margin-left:324.3pt;margin-top:134.1pt;width:53.7pt;height:18.9pt;flip:x y;z-index:251784192;visibility:visible;mso-wrap-style:square;mso-wrap-distance-left:9pt;mso-wrap-distance-top:0;mso-wrap-distance-right:9pt;mso-wrap-distance-bottom:0;mso-position-horizontal:absolute;mso-position-horizontal-relative:text;mso-position-vertical:absolute;mso-position-vertical-relative:text" o:gfxdata="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" strokecolor="#156082 [3204]" strokeweight=".5pt">
+              <v:shape w14:anchorId="7D91F47F" id="מחבר חץ ישר 17" o:spid="_x0000_s1026" type="#_x0000_t32" style="position:absolute;margin-left:324.3pt;margin-top:134.1pt;width:53.7pt;height:18.9pt;flip:x y;z-index:251784192;visibility:visible;mso-wrap-style:square;mso-wrap-distance-left:9pt;mso-wrap-distance-top:0;mso-wrap-distance-right:9pt;mso-wrap-distance-bottom:0;mso-position-horizontal:absolute;mso-position-horizontal-relative:text;mso-position-vertical:absolute;mso-position-vertical-relative:text" o:gfxdata="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" strokecolor="#156082 [3204]" strokeweight=".5pt">
                 <v:stroke endarrow="block" joinstyle="miter"/>
               </v:shape>
             </w:pict>
@@ -33730,7 +33722,7 @@
           </mc:Choice>
           <mc:Fallback>
             <w:pict>
-              <v:rect w14:anchorId="4E7CF7CD" id="מלבן 14" o:spid="_x0000_s1048" style="position:absolute;margin-left:71.95pt;margin-top:153.35pt;width:107.85pt;height:21.35pt;z-index:251779072;visibility:visible;mso-wrap-style:square;mso-width-percent:0;mso-height-percent:0;mso-wrap-distance-left:9pt;mso-wrap-distance-top:0;mso-wrap-distance-right:9pt;mso-wrap-distance-bottom:0;mso-position-horizontal:absolute;mso-position-horizontal-relative:text;mso-position-vertical:absolute;mso-position-vertical-relative:text;mso-width-percent:0;mso-height-percent:0;mso-width-relative:margin;mso-height-relative:margin;v-text-anchor:middle" o:gfxdata="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" fillcolor="white [3201]" strokecolor="black [3200]" strokeweight="1pt">
+              <v:rect w14:anchorId="4E7CF7CD" id="מלבן 14" o:spid="_x0000_s1048" style="position:absolute;margin-left:71.95pt;margin-top:153.35pt;width:107.85pt;height:21.35pt;z-index:251779072;visibility:visible;mso-wrap-style:square;mso-width-percent:0;mso-height-percent:0;mso-wrap-distance-left:9pt;mso-wrap-distance-top:0;mso-wrap-distance-right:9pt;mso-wrap-distance-bottom:0;mso-position-horizontal:absolute;mso-position-horizontal-relative:text;mso-position-vertical:absolute;mso-position-vertical-relative:text;mso-width-percent:0;mso-height-percent:0;mso-width-relative:margin;mso-height-relative:margin;v-text-anchor:middle" o:gfxdata="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" fillcolor="white [3201]" strokecolor="black [3200]" strokeweight="1pt">
                 <v:textbox>
                   <w:txbxContent>
                     <w:p>
@@ -33860,7 +33852,7 @@
           </mc:Choice>
           <mc:Fallback>
             <w:pict>
-              <v:rect w14:anchorId="0DD58D96" id="מלבן 16" o:spid="_x0000_s1049" style="position:absolute;margin-left:324.3pt;margin-top:153pt;width:107.7pt;height:21.35pt;z-index:251783168;visibility:visible;mso-wrap-style:square;mso-width-percent:0;mso-height-percent:0;mso-wrap-distance-left:9pt;mso-wrap-distance-top:0;mso-wrap-distance-right:9pt;mso-wrap-distance-bottom:0;mso-position-horizontal:absolute;mso-position-horizontal-relative:text;mso-position-vertical:absolute;mso-position-vertical-relative:text;mso-width-percent:0;mso-height-percent:0;mso-width-relative:margin;mso-height-relative:margin;v-text-anchor:middle" o:gfxdata="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" fillcolor="white [3201]" strokecolor="black [3200]" strokeweight="1pt">
+              <v:rect w14:anchorId="0DD58D96" id="מלבן 16" o:spid="_x0000_s1049" style="position:absolute;margin-left:324.3pt;margin-top:153pt;width:107.7pt;height:21.35pt;z-index:251783168;visibility:visible;mso-wrap-style:square;mso-width-percent:0;mso-height-percent:0;mso-wrap-distance-left:9pt;mso-wrap-distance-top:0;mso-wrap-distance-right:9pt;mso-wrap-distance-bottom:0;mso-position-horizontal:absolute;mso-position-horizontal-relative:text;mso-position-vertical:absolute;mso-position-vertical-relative:text;mso-width-percent:0;mso-height-percent:0;mso-width-relative:margin;mso-height-relative:margin;v-text-anchor:middle" o:gfxdata="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" fillcolor="white [3201]" strokecolor="black [3200]" strokeweight="1pt">
                 <v:textbox>
                   <w:txbxContent>
                     <w:p>
@@ -33990,7 +33982,7 @@
           </mc:Choice>
           <mc:Fallback>
             <w:pict>
-              <v:rect w14:anchorId="137650E5" id="מלבן 15" o:spid="_x0000_s1050" style="position:absolute;margin-left:198.15pt;margin-top:153pt;width:107.85pt;height:21.35pt;z-index:251781120;visibility:visible;mso-wrap-style:square;mso-width-percent:0;mso-height-percent:0;mso-wrap-distance-left:9pt;mso-wrap-distance-top:0;mso-wrap-distance-right:9pt;mso-wrap-distance-bottom:0;mso-position-horizontal:absolute;mso-position-horizontal-relative:text;mso-position-vertical:absolute;mso-position-vertical-relative:text;mso-width-percent:0;mso-height-percent:0;mso-width-relative:margin;mso-height-relative:margin;v-text-anchor:middle" o:gfxdata="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" fillcolor="white [3201]" strokecolor="black [3200]" strokeweight="1pt">
+              <v:rect w14:anchorId="137650E5" id="מלבן 15" o:spid="_x0000_s1050" style="position:absolute;margin-left:198.15pt;margin-top:153pt;width:107.85pt;height:21.35pt;z-index:251781120;visibility:visible;mso-wrap-style:square;mso-width-percent:0;mso-height-percent:0;mso-wrap-distance-left:9pt;mso-wrap-distance-top:0;mso-wrap-distance-right:9pt;mso-wrap-distance-bottom:0;mso-position-horizontal:absolute;mso-position-horizontal-relative:text;mso-position-vertical:absolute;mso-position-vertical-relative:text;mso-width-percent:0;mso-height-percent:0;mso-width-relative:margin;mso-height-relative:margin;v-text-anchor:middle" o:gfxdata="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" fillcolor="white [3201]" strokecolor="black [3200]" strokeweight="1pt">
                 <v:textbox>
                   <w:txbxContent>
                     <w:p>
@@ -34120,7 +34112,7 @@
           </mc:Choice>
           <mc:Fallback>
             <w:pict>
-              <v:rect w14:anchorId="61A2D49E" id="מלבן 13" o:spid="_x0000_s1051" style="position:absolute;margin-left:188.65pt;margin-top:103.7pt;width:135.35pt;height:30.35pt;z-index:251777024;visibility:visible;mso-wrap-style:square;mso-width-percent:0;mso-height-percent:0;mso-wrap-distance-left:9pt;mso-wrap-distance-top:0;mso-wrap-distance-right:9pt;mso-wrap-distance-bottom:0;mso-position-horizontal:absolute;mso-position-horizontal-relative:text;mso-position-vertical:absolute;mso-position-vertical-relative:text;mso-width-percent:0;mso-height-percent:0;mso-width-relative:margin;mso-height-relative:margin;v-text-anchor:middle" o:gfxdata="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" fillcolor="white [3201]" strokecolor="black [3200]" strokeweight="1pt">
+              <v:rect w14:anchorId="61A2D49E" id="מלבן 13" o:spid="_x0000_s1051" style="position:absolute;margin-left:188.65pt;margin-top:103.7pt;width:135.35pt;height:30.35pt;z-index:251777024;visibility:visible;mso-wrap-style:square;mso-width-percent:0;mso-height-percent:0;mso-wrap-distance-left:9pt;mso-wrap-distance-top:0;mso-wrap-distance-right:9pt;mso-wrap-distance-bottom:0;mso-position-horizontal:absolute;mso-position-horizontal-relative:text;mso-position-vertical:absolute;mso-position-vertical-relative:text;mso-width-percent:0;mso-height-percent:0;mso-width-relative:margin;mso-height-relative:margin;v-text-anchor:middle" o:gfxdata="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" fillcolor="white [3201]" strokecolor="black [3200]" strokeweight="1pt">
                 <v:textbox>
                   <w:txbxContent>
                     <w:p>
@@ -34216,7 +34208,7 @@
           </mc:Choice>
           <mc:Fallback>
             <w:pict>
-              <v:shape w14:anchorId="7339C1C1" id="מחבר חץ ישר 12" o:spid="_x0000_s1026" type="#_x0000_t32" style="position:absolute;margin-left:252pt;margin-top:36pt;width:0;height:35.8pt;flip:y;z-index:251774976;visibility:visible;mso-wrap-style:square;mso-wrap-distance-left:9pt;mso-wrap-distance-top:0;mso-wrap-distance-right:9pt;mso-wrap-distance-bottom:0;mso-position-horizontal:absolute;mso-position-horizontal-relative:text;mso-position-vertical:absolute;mso-position-vertical-relative:text" o:gfxdata="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" strokecolor="#156082 [3204]" strokeweight=".5pt">
+              <v:shape w14:anchorId="1F13306C" id="מחבר חץ ישר 12" o:spid="_x0000_s1026" type="#_x0000_t32" style="position:absolute;margin-left:252pt;margin-top:36pt;width:0;height:35.8pt;flip:y;z-index:251774976;visibility:visible;mso-wrap-style:square;mso-wrap-distance-left:9pt;mso-wrap-distance-top:0;mso-wrap-distance-right:9pt;mso-wrap-distance-bottom:0;mso-position-horizontal:absolute;mso-position-horizontal-relative:text;mso-position-vertical:absolute;mso-position-vertical-relative:text" o:gfxdata="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" strokecolor="#156082 [3204]" strokeweight=".5pt">
                 <v:stroke endarrow="block" joinstyle="miter"/>
               </v:shape>
             </w:pict>
@@ -34321,7 +34313,7 @@
           </mc:Choice>
           <mc:Fallback>
             <w:pict>
-              <v:rect w14:anchorId="1219955E" id="מלבן 10" o:spid="_x0000_s1052" style="position:absolute;margin-left:188.95pt;margin-top:4.95pt;width:135.35pt;height:30.35pt;z-index:251771904;visibility:visible;mso-wrap-style:square;mso-width-percent:0;mso-height-percent:0;mso-wrap-distance-left:9pt;mso-wrap-distance-top:0;mso-wrap-distance-right:9pt;mso-wrap-distance-bottom:0;mso-position-horizontal:absolute;mso-position-horizontal-relative:text;mso-position-vertical:absolute;mso-position-vertical-relative:text;mso-width-percent:0;mso-height-percent:0;mso-width-relative:margin;mso-height-relative:margin;v-text-anchor:middle" o:gfxdata="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" fillcolor="white [3201]" strokecolor="black [3200]" strokeweight="1pt">
+              <v:rect w14:anchorId="1219955E" id="מלבן 10" o:spid="_x0000_s1052" style="position:absolute;margin-left:188.95pt;margin-top:4.95pt;width:135.35pt;height:30.35pt;z-index:251771904;visibility:visible;mso-wrap-style:square;mso-width-percent:0;mso-height-percent:0;mso-wrap-distance-left:9pt;mso-wrap-distance-top:0;mso-wrap-distance-right:9pt;mso-wrap-distance-bottom:0;mso-position-horizontal:absolute;mso-position-horizontal-relative:text;mso-position-vertical:absolute;mso-position-vertical-relative:text;mso-width-percent:0;mso-height-percent:0;mso-width-relative:margin;mso-height-relative:margin;v-text-anchor:middle" o:gfxdata="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" fillcolor="white [3201]" strokecolor="black [3200]" strokeweight="1pt">
                 <v:textbox>
                   <w:txbxContent>
                     <w:p>
@@ -34457,7 +34449,7 @@
           </mc:Choice>
           <mc:Fallback>
             <w:pict>
-              <v:rect w14:anchorId="103B171E" id="מלבן 11" o:spid="_x0000_s1053" style="position:absolute;margin-left:188.65pt;margin-top:71.8pt;width:135.35pt;height:32pt;z-index:251773952;visibility:visible;mso-wrap-style:square;mso-width-percent:0;mso-height-percent:0;mso-wrap-distance-left:9pt;mso-wrap-distance-top:0;mso-wrap-distance-right:9pt;mso-wrap-distance-bottom:0;mso-position-horizontal:absolute;mso-position-horizontal-relative:text;mso-position-vertical:absolute;mso-position-vertical-relative:text;mso-width-percent:0;mso-height-percent:0;mso-width-relative:margin;mso-height-relative:margin;v-text-anchor:middle" o:gfxdata="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" fillcolor="white [3201]" strokecolor="black [3200]" strokeweight="1pt">
+              <v:rect w14:anchorId="103B171E" id="מלבן 11" o:spid="_x0000_s1053" style="position:absolute;margin-left:188.65pt;margin-top:71.8pt;width:135.35pt;height:32pt;z-index:251773952;visibility:visible;mso-wrap-style:square;mso-width-percent:0;mso-height-percent:0;mso-wrap-distance-left:9pt;mso-wrap-distance-top:0;mso-wrap-distance-right:9pt;mso-wrap-distance-bottom:0;mso-position-horizontal:absolute;mso-position-horizontal-relative:text;mso-position-vertical:absolute;mso-position-vertical-relative:text;mso-width-percent:0;mso-height-percent:0;mso-width-relative:margin;mso-height-relative:margin;v-text-anchor:middle" o:gfxdata="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" fillcolor="white [3201]" strokecolor="black [3200]" strokeweight="1pt">
                 <v:textbox>
                   <w:txbxContent>
                     <w:p>
@@ -34807,198 +34799,153 @@
     </w:p>
     <w:p>
       <w:pPr>
-        <w:pBdr>
-          <w:bottom w:val="single" w:sz="6" w:space="1" w:color="auto"/>
-        </w:pBdr>
         <w:suppressAutoHyphens w:val="0"/>
         <w:autoSpaceDN/>
-        <w:spacing w:after="0" w:line="240" w:lineRule="auto"/>
+        <w:bidi/>
+        <w:spacing w:before="100" w:beforeAutospacing="1" w:after="100" w:afterAutospacing="1" w:line="240" w:lineRule="auto"/>
+        <w:rPr>
+          <w:rFonts w:ascii="David" w:eastAsia="Times New Roman" w:hAnsi="David" w:cs="David"/>
+          <w:sz w:val="36"/>
+          <w:szCs w:val="36"/>
+          <w:rtl/>
+          <w:lang w:val="en-US"/>
+        </w:rPr>
+      </w:pPr>
+      <w:r>
+        <w:rPr>
+          <w:rFonts w:ascii="David" w:eastAsia="Times New Roman" w:hAnsi="David" w:cs="David"/>
+          <w:sz w:val="36"/>
+          <w:szCs w:val="36"/>
+          <w:lang w:val="en-US"/>
+        </w:rPr>
+        <w:t>Track</w:t>
+      </w:r>
+      <w:r>
+        <w:rPr>
+          <w:rFonts w:ascii="David" w:eastAsia="Times New Roman" w:hAnsi="David" w:cs="David" w:hint="cs"/>
+          <w:sz w:val="36"/>
+          <w:szCs w:val="36"/>
+          <w:rtl/>
+          <w:lang w:val="en-US"/>
+        </w:rPr>
+        <w:t xml:space="preserve">-זאת מחלקה שבעצם בעזרת ניתן לעלות אובייקטים מסוג </w:t>
+      </w:r>
+      <w:r>
+        <w:rPr>
+          <w:rFonts w:ascii="David" w:eastAsia="Times New Roman" w:hAnsi="David" w:cs="David"/>
+          <w:sz w:val="36"/>
+          <w:szCs w:val="36"/>
+          <w:lang w:val="en-US"/>
+        </w:rPr>
+        <w:t>TrackMongo1</w:t>
+      </w:r>
+      <w:r>
+        <w:rPr>
+          <w:rFonts w:ascii="David" w:eastAsia="Times New Roman" w:hAnsi="David" w:cs="David" w:hint="cs"/>
+          <w:sz w:val="36"/>
+          <w:szCs w:val="36"/>
+          <w:rtl/>
+          <w:lang w:val="en-US"/>
+        </w:rPr>
+        <w:t xml:space="preserve">-שזהו אובייקט שנעלה לענן של </w:t>
+      </w:r>
+      <w:r>
+        <w:rPr>
+          <w:rFonts w:ascii="David" w:eastAsia="Times New Roman" w:hAnsi="David" w:cs="David"/>
+          <w:sz w:val="36"/>
+          <w:szCs w:val="36"/>
+          <w:lang w:val="en-US"/>
+        </w:rPr>
+        <w:t>MONGO DB</w:t>
+      </w:r>
+      <w:r>
+        <w:rPr>
+          <w:rFonts w:ascii="David" w:eastAsia="Times New Roman" w:hAnsi="David" w:cs="David" w:hint="cs"/>
+          <w:sz w:val="36"/>
+          <w:szCs w:val="36"/>
+          <w:rtl/>
+          <w:lang w:val="en-US"/>
+        </w:rPr>
+        <w:t xml:space="preserve"> ששומר את פרטי </w:t>
+      </w:r>
+      <w:proofErr w:type="gramStart"/>
+      <w:r>
+        <w:rPr>
+          <w:rFonts w:ascii="David" w:eastAsia="Times New Roman" w:hAnsi="David" w:cs="David" w:hint="cs"/>
+          <w:sz w:val="36"/>
+          <w:szCs w:val="36"/>
+          <w:rtl/>
+          <w:lang w:val="en-US"/>
+        </w:rPr>
+        <w:t>המסלול ,ו</w:t>
+      </w:r>
+      <w:r>
+        <w:rPr>
+          <w:rFonts w:ascii="David" w:eastAsia="Times New Roman" w:hAnsi="David" w:cs="David" w:hint="cs"/>
+          <w:sz w:val="36"/>
+          <w:szCs w:val="36"/>
+          <w:rtl/>
+          <w:lang w:val="en-US"/>
+        </w:rPr>
+        <w:t>ניתן</w:t>
+      </w:r>
+      <w:proofErr w:type="gramEnd"/>
+      <w:r>
+        <w:rPr>
+          <w:rFonts w:ascii="David" w:eastAsia="Times New Roman" w:hAnsi="David" w:cs="David" w:hint="cs"/>
+          <w:sz w:val="36"/>
+          <w:szCs w:val="36"/>
+          <w:rtl/>
+          <w:lang w:val="en-US"/>
+        </w:rPr>
+        <w:t xml:space="preserve"> לעלות את הרשימה של ה</w:t>
+      </w:r>
+      <w:r>
+        <w:rPr>
+          <w:rFonts w:ascii="David" w:eastAsia="Times New Roman" w:hAnsi="David" w:cs="David"/>
+          <w:sz w:val="36"/>
+          <w:szCs w:val="36"/>
+          <w:lang w:val="en-US"/>
+        </w:rPr>
+        <w:t>MAPPIN</w:t>
+      </w:r>
+      <w:r>
+        <w:rPr>
+          <w:rFonts w:ascii="David" w:eastAsia="Times New Roman" w:hAnsi="David" w:cs="David" w:hint="cs"/>
+          <w:sz w:val="36"/>
+          <w:szCs w:val="36"/>
+          <w:rtl/>
+          <w:lang w:val="en-US"/>
+        </w:rPr>
+        <w:t xml:space="preserve"> שיוצרים את המסלול עצמו . </w:t>
+      </w:r>
+    </w:p>
+    <w:p>
+      <w:pPr>
+        <w:bidi/>
         <w:jc w:val="center"/>
         <w:rPr>
-          <w:rFonts w:ascii="Arial" w:eastAsia="Times New Roman" w:hAnsi="Arial"/>
-          <w:vanish/>
-          <w:sz w:val="16"/>
-          <w:szCs w:val="16"/>
-          <w:lang w:val="en-US"/>
-        </w:rPr>
-      </w:pPr>
-      <w:r>
-        <w:rPr>
-          <w:rFonts w:ascii="Arial" w:eastAsia="Times New Roman" w:hAnsi="Arial"/>
-          <w:vanish/>
-          <w:sz w:val="16"/>
-          <w:szCs w:val="16"/>
-          <w:rtl/>
-          <w:lang w:val="en-US"/>
-        </w:rPr>
-        <w:t>ראש הטופס</w:t>
-      </w:r>
-    </w:p>
-    <w:p>
-      <w:pPr>
-        <w:pBdr>
-          <w:top w:val="single" w:sz="6" w:space="1" w:color="auto"/>
-        </w:pBdr>
-        <w:suppressAutoHyphens w:val="0"/>
-        <w:autoSpaceDN/>
-        <w:spacing w:after="0" w:line="240" w:lineRule="auto"/>
-        <w:jc w:val="center"/>
-        <w:rPr>
-          <w:rFonts w:ascii="Arial" w:eastAsia="Times New Roman" w:hAnsi="Arial"/>
-          <w:vanish/>
-          <w:sz w:val="16"/>
-          <w:szCs w:val="16"/>
-          <w:lang w:val="en-US"/>
-        </w:rPr>
-      </w:pPr>
-      <w:r>
-        <w:rPr>
-          <w:rFonts w:ascii="Arial" w:eastAsia="Times New Roman" w:hAnsi="Arial"/>
-          <w:vanish/>
-          <w:sz w:val="16"/>
-          <w:szCs w:val="16"/>
-          <w:rtl/>
-          <w:lang w:val="en-US"/>
-        </w:rPr>
-        <w:t>תחתית הטופס</w:t>
-      </w:r>
-    </w:p>
-    <w:p>
-      <w:pPr>
-        <w:suppressAutoHyphens w:val="0"/>
-        <w:autoSpaceDN/>
-        <w:bidi/>
-        <w:spacing w:before="100" w:beforeAutospacing="1" w:after="100" w:afterAutospacing="1" w:line="240" w:lineRule="auto"/>
-        <w:rPr>
-          <w:rFonts w:ascii="David" w:eastAsia="Times New Roman" w:hAnsi="David" w:cs="David"/>
-          <w:sz w:val="36"/>
-          <w:szCs w:val="36"/>
-          <w:rtl/>
-          <w:lang w:val="en-US"/>
-        </w:rPr>
-      </w:pPr>
-      <w:proofErr w:type="spellStart"/>
-      <w:r>
-        <w:rPr>
-          <w:rFonts w:ascii="David" w:eastAsia="Times New Roman" w:hAnsi="David" w:cs="David" w:hint="cs"/>
-          <w:sz w:val="36"/>
-          <w:szCs w:val="36"/>
-          <w:lang w:val="en-US"/>
-        </w:rPr>
-        <w:t>M</w:t>
-      </w:r>
-      <w:r>
-        <w:rPr>
-          <w:rFonts w:ascii="David" w:eastAsia="Times New Roman" w:hAnsi="David" w:cs="David"/>
-          <w:sz w:val="36"/>
-          <w:szCs w:val="36"/>
-          <w:lang w:val="en-US"/>
-        </w:rPr>
-        <w:t>apsViewModel</w:t>
-      </w:r>
-      <w:proofErr w:type="spellEnd"/>
-      <w:r>
-        <w:rPr>
-          <w:rFonts w:ascii="David" w:eastAsia="Times New Roman" w:hAnsi="David" w:cs="David" w:hint="cs"/>
-          <w:sz w:val="36"/>
-          <w:szCs w:val="36"/>
-          <w:rtl/>
-          <w:lang w:val="en-US"/>
-        </w:rPr>
-        <w:t xml:space="preserve">-במחלקה זו קיימת הרשימה </w:t>
-      </w:r>
-      <w:r>
-        <w:rPr>
-          <w:rFonts w:ascii="David" w:eastAsia="Times New Roman" w:hAnsi="David" w:cs="David"/>
-          <w:sz w:val="36"/>
-          <w:szCs w:val="36"/>
-          <w:lang w:val="en-US"/>
-        </w:rPr>
-        <w:t>maps</w:t>
-      </w:r>
-      <w:r>
-        <w:rPr>
-          <w:rFonts w:ascii="David" w:eastAsia="Times New Roman" w:hAnsi="David" w:cs="David" w:hint="cs"/>
-          <w:sz w:val="36"/>
-          <w:szCs w:val="36"/>
-          <w:rtl/>
-          <w:lang w:val="en-US"/>
-        </w:rPr>
-        <w:t xml:space="preserve">-רשימה זו מציגה את המסלולים של כל המשתמשים שבנו </w:t>
-      </w:r>
-      <w:proofErr w:type="gramStart"/>
-      <w:r>
-        <w:rPr>
-          <w:rFonts w:ascii="David" w:eastAsia="Times New Roman" w:hAnsi="David" w:cs="David" w:hint="cs"/>
-          <w:sz w:val="36"/>
-          <w:szCs w:val="36"/>
-          <w:rtl/>
-          <w:lang w:val="en-US"/>
-        </w:rPr>
-        <w:t>המשתמשים .</w:t>
-      </w:r>
-      <w:proofErr w:type="gramEnd"/>
-      <w:r>
-        <w:rPr>
-          <w:rFonts w:ascii="David" w:eastAsia="Times New Roman" w:hAnsi="David" w:cs="David" w:hint="cs"/>
-          <w:sz w:val="36"/>
-          <w:szCs w:val="36"/>
-          <w:rtl/>
-          <w:lang w:val="en-US"/>
-        </w:rPr>
-        <w:t xml:space="preserve"> </w:t>
-      </w:r>
-      <w:r>
-        <w:rPr>
-          <w:rFonts w:ascii="David" w:eastAsia="Times New Roman" w:hAnsi="David" w:cs="David" w:hint="cs"/>
-          <w:sz w:val="36"/>
-          <w:szCs w:val="36"/>
-          <w:rtl/>
-          <w:lang w:val="en-US"/>
-        </w:rPr>
-        <w:t>אם למשל משתמש בוחר מסלול מסוים ורוצה לעדכן את המסלול ,למשל להוריד נקודה מהמסלול או ההפך להוסיף נקודה על גבי המסלול אז האפליקציה תעלה את המסלול המקורי  בתוספת הנקודות החדשות אבל אם שינוי השם .</w:t>
-      </w:r>
-    </w:p>
-    <w:p>
-      <w:pPr>
-        <w:bidi/>
-        <w:rPr>
-          <w:rFonts w:ascii="David" w:hAnsi="David" w:cs="David"/>
-          <w:sz w:val="36"/>
-          <w:szCs w:val="36"/>
-          <w:rtl/>
-          <w:lang w:val="en-US"/>
-        </w:rPr>
-      </w:pPr>
-      <w:r>
-        <w:rPr>
-          <w:rFonts w:ascii="David" w:hAnsi="David" w:cs="David"/>
+          <w:rFonts w:ascii="David" w:hAnsi="David" w:cs="David"/>
+          <w:sz w:val="36"/>
+          <w:szCs w:val="36"/>
+          <w:rtl/>
+          <w:lang w:val="en-US"/>
+        </w:rPr>
+      </w:pPr>
+      <w:r>
+        <w:rPr>
+          <w:rFonts w:ascii="David" w:hAnsi="David" w:cs="David"/>
+          <w:noProof/>
           <w:sz w:val="36"/>
           <w:szCs w:val="36"/>
           <w:rtl/>
           <w:lang w:val="en-US"/>
         </w:rPr>
         <w:drawing>
-          <wp:anchor distT="0" distB="0" distL="114300" distR="114300" simplePos="0" relativeHeight="251638272" behindDoc="0" locked="0" layoutInCell="1" allowOverlap="1" wp14:anchorId="234CA407" wp14:editId="0B91168F">
-            <wp:simplePos x="0" y="0"/>
-            <wp:positionH relativeFrom="column">
-              <wp:posOffset>1257300</wp:posOffset>
-            </wp:positionH>
-            <wp:positionV relativeFrom="paragraph">
-              <wp:posOffset>-52705</wp:posOffset>
-            </wp:positionV>
-            <wp:extent cx="2749064" cy="2647642"/>
-            <wp:effectExtent l="0" t="0" r="0" b="635"/>
-            <wp:wrapThrough wrapText="bothSides">
-              <wp:wrapPolygon edited="0">
-                <wp:start x="0" y="0"/>
-                <wp:lineTo x="0" y="21450"/>
-                <wp:lineTo x="21405" y="21450"/>
-                <wp:lineTo x="21405" y="0"/>
-                <wp:lineTo x="0" y="0"/>
-              </wp:wrapPolygon>
-            </wp:wrapThrough>
-            <wp:docPr id="1668824023" name="Picture 1"/>
+          <wp:inline distT="0" distB="0" distL="0" distR="0" wp14:anchorId="2FAC07D9" wp14:editId="001780D9">
+            <wp:extent cx="2929890" cy="3187627"/>
+            <wp:effectExtent l="0" t="0" r="3810" b="0"/>
+            <wp:docPr id="891687798" name="Picture 1"/>
             <wp:cNvGraphicFramePr>
               <a:graphicFrameLocks xmlns:a="http://schemas.openxmlformats.org/drawingml/2006/main" noChangeAspect="1"/>
             </wp:cNvGraphicFramePr>
@@ -35006,17 +34953,11 @@
               <a:graphicData uri="http://schemas.openxmlformats.org/drawingml/2006/picture">
                 <pic:pic xmlns:pic="http://schemas.openxmlformats.org/drawingml/2006/picture">
                   <pic:nvPicPr>
-                    <pic:cNvPr id="1668824023" name=""/>
+                    <pic:cNvPr id="891687798" name=""/>
                     <pic:cNvPicPr/>
                   </pic:nvPicPr>
                   <pic:blipFill>
-                    <a:blip r:embed="rId48" cstate="print">
-                      <a:extLst>
-                        <a:ext uri="{28A0092B-C50C-407E-A947-70E740481C1C}">
-                          <a14:useLocalDpi xmlns:a14="http://schemas.microsoft.com/office/drawing/2010/main" val="0"/>
-                        </a:ext>
-                      </a:extLst>
-                    </a:blip>
+                    <a:blip r:embed="rId48"/>
                     <a:stretch>
                       <a:fillRect/>
                     </a:stretch>
@@ -35024,7 +34965,7 @@
                   <pic:spPr>
                     <a:xfrm>
                       <a:off x="0" y="0"/>
-                      <a:ext cx="2749743" cy="2648296"/>
+                      <a:ext cx="2936258" cy="3194555"/>
                     </a:xfrm>
                     <a:prstGeom prst="rect">
                       <a:avLst/>
@@ -35033,236 +34974,8 @@
                 </pic:pic>
               </a:graphicData>
             </a:graphic>
-            <wp14:sizeRelH relativeFrom="margin">
-              <wp14:pctWidth>0</wp14:pctWidth>
-            </wp14:sizeRelH>
-            <wp14:sizeRelV relativeFrom="margin">
-              <wp14:pctHeight>0</wp14:pctHeight>
-            </wp14:sizeRelV>
-          </wp:anchor>
+          </wp:inline>
         </w:drawing>
-      </w:r>
-    </w:p>
-    <w:p>
-      <w:pPr>
-        <w:suppressAutoHyphens w:val="0"/>
-        <w:bidi/>
-        <w:rPr>
-          <w:rFonts w:ascii="David" w:hAnsi="David" w:cs="David"/>
-          <w:sz w:val="36"/>
-          <w:szCs w:val="36"/>
-          <w:lang w:val="en-US"/>
-        </w:rPr>
-      </w:pPr>
-      <w:r>
-        <w:rPr>
-          <w:rFonts w:ascii="David" w:hAnsi="David" w:cs="David"/>
-          <w:noProof/>
-          <w:sz w:val="36"/>
-          <w:szCs w:val="36"/>
-          <w:rtl/>
-          <w:lang w:val="he-IL"/>
-        </w:rPr>
-        <mc:AlternateContent>
-          <mc:Choice Requires="wpi">
-            <w:drawing>
-              <wp:anchor distT="0" distB="0" distL="114300" distR="114300" simplePos="0" relativeHeight="251795456" behindDoc="0" locked="0" layoutInCell="1" allowOverlap="1" wp14:anchorId="27614649" wp14:editId="6F222277">
-                <wp:simplePos x="0" y="0"/>
-                <wp:positionH relativeFrom="column">
-                  <wp:posOffset>1818640</wp:posOffset>
-                </wp:positionH>
-                <wp:positionV relativeFrom="paragraph">
-                  <wp:posOffset>684530</wp:posOffset>
-                </wp:positionV>
-                <wp:extent cx="300990" cy="160350"/>
-                <wp:effectExtent l="57150" t="57150" r="3810" b="49530"/>
-                <wp:wrapNone/>
-                <wp:docPr id="1284068687" name="Ink 76"/>
-                <wp:cNvGraphicFramePr/>
-                <a:graphic xmlns:a="http://schemas.openxmlformats.org/drawingml/2006/main">
-                  <a:graphicData uri="http://schemas.microsoft.com/office/word/2010/wordprocessingInk">
-                    <w14:contentPart bwMode="auto" r:id="rId49">
-                      <w14:nvContentPartPr>
-                        <w14:cNvContentPartPr/>
-                      </w14:nvContentPartPr>
-                      <w14:xfrm>
-                        <a:off x="0" y="0"/>
-                        <a:ext cx="300990" cy="160350"/>
-                      </w14:xfrm>
-                    </w14:contentPart>
-                  </a:graphicData>
-                </a:graphic>
-              </wp:anchor>
-            </w:drawing>
-          </mc:Choice>
-          <mc:Fallback>
-            <w:pict>
-              <v:shape w14:anchorId="471503D0" id="Ink 76" o:spid="_x0000_s1026" type="#_x0000_t75" style="position:absolute;margin-left:142.5pt;margin-top:53.2pt;width:25.1pt;height:14.05pt;z-index:251795456;visibility:visible;mso-wrap-style:square;mso-wrap-distance-left:9pt;mso-wrap-distance-top:0;mso-wrap-distance-right:9pt;mso-wrap-distance-bottom:0;mso-position-horizontal:absolute;mso-position-horizontal-relative:text;mso-position-vertical:absolute;mso-position-vertical-relative:text" o:gfxdata="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">
-                <v:imagedata r:id="rId50" o:title=""/>
-              </v:shape>
-            </w:pict>
-          </mc:Fallback>
-        </mc:AlternateContent>
-      </w:r>
-      <w:r>
-        <w:rPr>
-          <w:rFonts w:ascii="David" w:hAnsi="David" w:cs="David"/>
-          <w:noProof/>
-          <w:sz w:val="36"/>
-          <w:szCs w:val="36"/>
-          <w:rtl/>
-          <w:lang w:val="he-IL"/>
-        </w:rPr>
-        <mc:AlternateContent>
-          <mc:Choice Requires="wpi">
-            <w:drawing>
-              <wp:anchor distT="0" distB="0" distL="114300" distR="114300" simplePos="0" relativeHeight="251790336" behindDoc="0" locked="0" layoutInCell="1" allowOverlap="1" wp14:anchorId="01392E60" wp14:editId="46DA3BD9">
-                <wp:simplePos x="0" y="0"/>
-                <wp:positionH relativeFrom="column">
-                  <wp:posOffset>3257065</wp:posOffset>
-                </wp:positionH>
-                <wp:positionV relativeFrom="paragraph">
-                  <wp:posOffset>1183205</wp:posOffset>
-                </wp:positionV>
-                <wp:extent cx="328320" cy="10800"/>
-                <wp:effectExtent l="133350" t="133350" r="90805" b="122555"/>
-                <wp:wrapNone/>
-                <wp:docPr id="553422002" name="Ink 71"/>
-                <wp:cNvGraphicFramePr/>
-                <a:graphic xmlns:a="http://schemas.openxmlformats.org/drawingml/2006/main">
-                  <a:graphicData uri="http://schemas.microsoft.com/office/word/2010/wordprocessingInk">
-                    <w14:contentPart bwMode="auto" r:id="rId51">
-                      <w14:nvContentPartPr>
-                        <w14:cNvContentPartPr/>
-                      </w14:nvContentPartPr>
-                      <w14:xfrm>
-                        <a:off x="0" y="0"/>
-                        <a:ext cx="328320" cy="10800"/>
-                      </w14:xfrm>
-                    </w14:contentPart>
-                  </a:graphicData>
-                </a:graphic>
-              </wp:anchor>
-            </w:drawing>
-          </mc:Choice>
-          <mc:Fallback>
-            <w:pict>
-              <v:shape w14:anchorId="738B0826" id="Ink 71" o:spid="_x0000_s1026" type="#_x0000_t75" style="position:absolute;margin-left:251.5pt;margin-top:88.2pt;width:35.75pt;height:10.75pt;z-index:251790336;visibility:visible;mso-wrap-style:square;mso-wrap-distance-left:9pt;mso-wrap-distance-top:0;mso-wrap-distance-right:9pt;mso-wrap-distance-bottom:0;mso-position-horizontal:absolute;mso-position-horizontal-relative:text;mso-position-vertical:absolute;mso-position-vertical-relative:text" o:gfxdata="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">
-                <v:imagedata r:id="rId52" o:title=""/>
-              </v:shape>
-            </w:pict>
-          </mc:Fallback>
-        </mc:AlternateContent>
-      </w:r>
-      <w:r>
-        <w:rPr>
-          <w:rFonts w:ascii="David" w:hAnsi="David" w:cs="David"/>
-          <w:noProof/>
-          <w:sz w:val="36"/>
-          <w:szCs w:val="36"/>
-          <w:rtl/>
-          <w:lang w:val="he-IL"/>
-        </w:rPr>
-        <mc:AlternateContent>
-          <mc:Choice Requires="wpi">
-            <w:drawing>
-              <wp:anchor distT="0" distB="0" distL="114300" distR="114300" simplePos="0" relativeHeight="251789312" behindDoc="0" locked="0" layoutInCell="1" allowOverlap="1" wp14:anchorId="2CF1F4F1" wp14:editId="33B6EBD6">
-                <wp:simplePos x="0" y="0"/>
-                <wp:positionH relativeFrom="column">
-                  <wp:posOffset>3238345</wp:posOffset>
-                </wp:positionH>
-                <wp:positionV relativeFrom="paragraph">
-                  <wp:posOffset>910325</wp:posOffset>
-                </wp:positionV>
-                <wp:extent cx="406080" cy="71640"/>
-                <wp:effectExtent l="133350" t="133350" r="108585" b="119380"/>
-                <wp:wrapNone/>
-                <wp:docPr id="1599631451" name="Ink 70"/>
-                <wp:cNvGraphicFramePr/>
-                <a:graphic xmlns:a="http://schemas.openxmlformats.org/drawingml/2006/main">
-                  <a:graphicData uri="http://schemas.microsoft.com/office/word/2010/wordprocessingInk">
-                    <w14:contentPart bwMode="auto" r:id="rId53">
-                      <w14:nvContentPartPr>
-                        <w14:cNvContentPartPr/>
-                      </w14:nvContentPartPr>
-                      <w14:xfrm>
-                        <a:off x="0" y="0"/>
-                        <a:ext cx="406080" cy="71640"/>
-                      </w14:xfrm>
-                    </w14:contentPart>
-                  </a:graphicData>
-                </a:graphic>
-              </wp:anchor>
-            </w:drawing>
-          </mc:Choice>
-          <mc:Fallback>
-            <w:pict>
-              <v:shape w14:anchorId="097C07BD" id="Ink 70" o:spid="_x0000_s1026" type="#_x0000_t75" style="position:absolute;margin-left:250.05pt;margin-top:66.75pt;width:41.85pt;height:15.6pt;z-index:251789312;visibility:visible;mso-wrap-style:square;mso-wrap-distance-left:9pt;mso-wrap-distance-top:0;mso-wrap-distance-right:9pt;mso-wrap-distance-bottom:0;mso-position-horizontal:absolute;mso-position-horizontal-relative:text;mso-position-vertical:absolute;mso-position-vertical-relative:text" o:gfxdata="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">
-                <v:imagedata r:id="rId54" o:title=""/>
-              </v:shape>
-            </w:pict>
-          </mc:Fallback>
-        </mc:AlternateContent>
-      </w:r>
-      <w:r>
-        <w:rPr>
-          <w:rFonts w:ascii="David" w:hAnsi="David" w:cs="David"/>
-          <w:noProof/>
-          <w:sz w:val="36"/>
-          <w:szCs w:val="36"/>
-          <w:rtl/>
-          <w:lang w:val="he-IL"/>
-        </w:rPr>
-        <mc:AlternateContent>
-          <mc:Choice Requires="wpi">
-            <w:drawing>
-              <wp:anchor distT="0" distB="0" distL="114300" distR="114300" simplePos="0" relativeHeight="251788288" behindDoc="0" locked="0" layoutInCell="1" allowOverlap="1" wp14:anchorId="732F05B4" wp14:editId="4066A6E7">
-                <wp:simplePos x="0" y="0"/>
-                <wp:positionH relativeFrom="column">
-                  <wp:posOffset>3196945</wp:posOffset>
-                </wp:positionH>
-                <wp:positionV relativeFrom="paragraph">
-                  <wp:posOffset>605045</wp:posOffset>
-                </wp:positionV>
-                <wp:extent cx="371520" cy="26640"/>
-                <wp:effectExtent l="133350" t="133350" r="66675" b="126365"/>
-                <wp:wrapNone/>
-                <wp:docPr id="867282057" name="Ink 69"/>
-                <wp:cNvGraphicFramePr/>
-                <a:graphic xmlns:a="http://schemas.openxmlformats.org/drawingml/2006/main">
-                  <a:graphicData uri="http://schemas.microsoft.com/office/word/2010/wordprocessingInk">
-                    <w14:contentPart bwMode="auto" r:id="rId55">
-                      <w14:nvContentPartPr>
-                        <w14:cNvContentPartPr/>
-                      </w14:nvContentPartPr>
-                      <w14:xfrm>
-                        <a:off x="0" y="0"/>
-                        <a:ext cx="371520" cy="26640"/>
-                      </w14:xfrm>
-                    </w14:contentPart>
-                  </a:graphicData>
-                </a:graphic>
-              </wp:anchor>
-            </w:drawing>
-          </mc:Choice>
-          <mc:Fallback>
-            <w:pict>
-              <v:shape w14:anchorId="5E1D9624" id="Ink 69" o:spid="_x0000_s1026" type="#_x0000_t75" style="position:absolute;margin-left:246.8pt;margin-top:42.7pt;width:39.15pt;height:12.05pt;z-index:251788288;visibility:visible;mso-wrap-style:square;mso-wrap-distance-left:9pt;mso-wrap-distance-top:0;mso-wrap-distance-right:9pt;mso-wrap-distance-bottom:0;mso-position-horizontal:absolute;mso-position-horizontal-relative:text;mso-position-vertical:absolute;mso-position-vertical-relative:text" o:gfxdata="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">
-                <v:imagedata r:id="rId56" o:title=""/>
-              </v:shape>
-            </w:pict>
-          </mc:Fallback>
-        </mc:AlternateContent>
-      </w:r>
-      <w:r>
-        <w:rPr>
-          <w:rFonts w:ascii="David" w:hAnsi="David" w:cs="David"/>
-          <w:sz w:val="36"/>
-          <w:szCs w:val="36"/>
-          <w:rtl/>
-          <w:lang w:val="en-US"/>
-        </w:rPr>
-        <w:br w:type="page"/>
       </w:r>
     </w:p>
     <w:p>
@@ -35448,7 +35161,7 @@
         <w:bidi/>
         <w:spacing w:before="100" w:beforeAutospacing="1" w:after="100" w:afterAutospacing="1" w:line="240" w:lineRule="auto"/>
         <w:rPr>
-          <w:rFonts w:ascii="David" w:eastAsia="Times New Roman" w:hAnsi="David" w:cs="David" w:hint="cs"/>
+          <w:rFonts w:ascii="David" w:eastAsia="Times New Roman" w:hAnsi="David" w:cs="David"/>
           <w:sz w:val="36"/>
           <w:szCs w:val="36"/>
           <w:rtl/>
@@ -35569,7 +35282,7 @@
                 <wp:cNvGraphicFramePr/>
                 <a:graphic xmlns:a="http://schemas.openxmlformats.org/drawingml/2006/main">
                   <a:graphicData uri="http://schemas.microsoft.com/office/word/2010/wordprocessingInk">
-                    <w14:contentPart bwMode="auto" r:id="rId57">
+                    <w14:contentPart bwMode="auto" r:id="rId49">
                       <w14:nvContentPartPr>
                         <w14:cNvContentPartPr/>
                       </w14:nvContentPartPr>
@@ -35585,8 +35298,8 @@
           </mc:Choice>
           <mc:Fallback>
             <w:pict>
-              <v:shape w14:anchorId="2C86D738" id="Ink 115" o:spid="_x0000_s1026" type="#_x0000_t75" style="position:absolute;margin-left:115.2pt;margin-top:84.25pt;width:254.3pt;height:88.65pt;z-index:251832320;visibility:visible;mso-wrap-style:square;mso-wrap-distance-left:9pt;mso-wrap-distance-top:0;mso-wrap-distance-right:9pt;mso-wrap-distance-bottom:0;mso-position-horizontal:absolute;mso-position-horizontal-relative:text;mso-position-vertical:absolute;mso-position-vertical-relative:text" o:gfxdata="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">
-                <v:imagedata r:id="rId58" o:title=""/>
+              <v:shape w14:anchorId="58CBDE6D" id="Ink 115" o:spid="_x0000_s1026" type="#_x0000_t75" style="position:absolute;margin-left:115.2pt;margin-top:84.25pt;width:254.3pt;height:88.65pt;z-index:251832320;visibility:visible;mso-wrap-style:square;mso-wrap-distance-left:9pt;mso-wrap-distance-top:0;mso-wrap-distance-right:9pt;mso-wrap-distance-bottom:0;mso-position-horizontal:absolute;mso-position-horizontal-relative:text;mso-position-vertical:absolute;mso-position-vertical-relative:text" o:gfxdata="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">
+                <v:imagedata r:id="rId50" o:title=""/>
               </v:shape>
             </w:pict>
           </mc:Fallback>
@@ -35621,7 +35334,7 @@
                 <wp:cNvGraphicFramePr/>
                 <a:graphic xmlns:a="http://schemas.openxmlformats.org/drawingml/2006/main">
                   <a:graphicData uri="http://schemas.microsoft.com/office/word/2010/wordprocessingInk">
-                    <w14:contentPart bwMode="auto" r:id="rId59">
+                    <w14:contentPart bwMode="auto" r:id="rId51">
                       <w14:nvContentPartPr>
                         <w14:cNvContentPartPr/>
                       </w14:nvContentPartPr>
@@ -35637,8 +35350,8 @@
           </mc:Choice>
           <mc:Fallback>
             <w:pict>
-              <v:shape w14:anchorId="312AFB7A" id="Ink 101" o:spid="_x0000_s1026" type="#_x0000_t75" style="position:absolute;margin-left:190.5pt;margin-top:133.3pt;width:126.1pt;height:18.75pt;z-index:251666944;visibility:visible;mso-wrap-style:square;mso-wrap-distance-left:9pt;mso-wrap-distance-top:0;mso-wrap-distance-right:9pt;mso-wrap-distance-bottom:0;mso-position-horizontal:absolute;mso-position-horizontal-relative:text;mso-position-vertical:absolute;mso-position-vertical-relative:text" o:gfxdata="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">
-                <v:imagedata r:id="rId60" o:title=""/>
+              <v:shape w14:anchorId="6B8D7B09" id="Ink 101" o:spid="_x0000_s1026" type="#_x0000_t75" style="position:absolute;margin-left:190.5pt;margin-top:133.3pt;width:126.1pt;height:18.75pt;z-index:251666944;visibility:visible;mso-wrap-style:square;mso-wrap-distance-left:9pt;mso-wrap-distance-top:0;mso-wrap-distance-right:9pt;mso-wrap-distance-bottom:0;mso-position-horizontal:absolute;mso-position-horizontal-relative:text;mso-position-vertical:absolute;mso-position-vertical-relative:text" o:gfxdata="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">
+                <v:imagedata r:id="rId52" o:title=""/>
               </v:shape>
             </w:pict>
           </mc:Fallback>
@@ -35673,7 +35386,7 @@
                 <wp:cNvGraphicFramePr/>
                 <a:graphic xmlns:a="http://schemas.openxmlformats.org/drawingml/2006/main">
                   <a:graphicData uri="http://schemas.microsoft.com/office/word/2010/wordprocessingInk">
-                    <w14:contentPart bwMode="auto" r:id="rId61">
+                    <w14:contentPart bwMode="auto" r:id="rId53">
                       <w14:nvContentPartPr>
                         <w14:cNvContentPartPr/>
                       </w14:nvContentPartPr>
@@ -35689,8 +35402,8 @@
           </mc:Choice>
           <mc:Fallback>
             <w:pict>
-              <v:shape w14:anchorId="2AA1D230" id="Ink 78" o:spid="_x0000_s1026" type="#_x0000_t75" style="position:absolute;margin-left:104pt;margin-top:134.8pt;width:23.65pt;height:25.4pt;z-index:251797504;visibility:visible;mso-wrap-style:square;mso-wrap-distance-left:9pt;mso-wrap-distance-top:0;mso-wrap-distance-right:9pt;mso-wrap-distance-bottom:0;mso-position-horizontal:absolute;mso-position-horizontal-relative:text;mso-position-vertical:absolute;mso-position-vertical-relative:text" o:gfxdata="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">
-                <v:imagedata r:id="rId62" o:title=""/>
+              <v:shape w14:anchorId="1B057A72" id="Ink 78" o:spid="_x0000_s1026" type="#_x0000_t75" style="position:absolute;margin-left:104pt;margin-top:134.8pt;width:23.65pt;height:25.4pt;z-index:251797504;visibility:visible;mso-wrap-style:square;mso-wrap-distance-left:9pt;mso-wrap-distance-top:0;mso-wrap-distance-right:9pt;mso-wrap-distance-bottom:0;mso-position-horizontal:absolute;mso-position-horizontal-relative:text;mso-position-vertical:absolute;mso-position-vertical-relative:text" o:gfxdata="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">
+                <v:imagedata r:id="rId54" o:title=""/>
               </v:shape>
             </w:pict>
           </mc:Fallback>
@@ -35762,7 +35475,7 @@
           </mc:Choice>
           <mc:Fallback>
             <w:pict>
-              <v:shape w14:anchorId="7A1B1313" id="Straight Arrow Connector 77" o:spid="_x0000_s1026" type="#_x0000_t32" style="position:absolute;margin-left:99pt;margin-top:42.75pt;width:81pt;height:0;z-index:251796480;visibility:visible;mso-wrap-style:square;mso-wrap-distance-left:9pt;mso-wrap-distance-top:0;mso-wrap-distance-right:9pt;mso-wrap-distance-bottom:0;mso-position-horizontal:absolute;mso-position-horizontal-relative:text;mso-position-vertical:absolute;mso-position-vertical-relative:text" o:gfxdata="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" strokecolor="black [3200]" strokeweight=".5pt">
+              <v:shape w14:anchorId="35AF9983" id="Straight Arrow Connector 77" o:spid="_x0000_s1026" type="#_x0000_t32" style="position:absolute;margin-left:99pt;margin-top:42.75pt;width:81pt;height:0;z-index:251796480;visibility:visible;mso-wrap-style:square;mso-wrap-distance-left:9pt;mso-wrap-distance-top:0;mso-wrap-distance-right:9pt;mso-wrap-distance-bottom:0;mso-position-horizontal:absolute;mso-position-horizontal-relative:text;mso-position-vertical:absolute;mso-position-vertical-relative:text" o:gfxdata="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" strokecolor="black [3200]" strokeweight=".5pt">
                 <v:stroke endarrow="block" joinstyle="miter"/>
               </v:shape>
             </w:pict>
@@ -35774,6 +35487,7 @@
           <w:rFonts w:ascii="David" w:hAnsi="David" w:cs="David"/>
           <w:b/>
           <w:bCs/>
+          <w:noProof/>
           <w:sz w:val="36"/>
           <w:szCs w:val="36"/>
           <w:rtl/>
@@ -35795,7 +35509,7 @@
                     <pic:cNvPicPr/>
                   </pic:nvPicPr>
                   <pic:blipFill>
-                    <a:blip r:embed="rId63"/>
+                    <a:blip r:embed="rId55"/>
                     <a:stretch>
                       <a:fillRect/>
                     </a:stretch>
@@ -35818,21 +35532,6 @@
     </w:p>
     <w:p>
       <w:pPr>
-        <w:suppressAutoHyphens w:val="0"/>
-        <w:rPr>
-          <w:lang w:val="en-US"/>
-        </w:rPr>
-      </w:pPr>
-      <w:r>
-        <w:rPr>
-          <w:lang w:val="en-US"/>
-        </w:rPr>
-        <w:lastRenderedPageBreak/>
-        <w:br w:type="page"/>
-      </w:r>
-    </w:p>
-    <w:p>
-      <w:pPr>
         <w:jc w:val="center"/>
         <w:rPr>
           <w:b/>
@@ -35864,12 +35563,47 @@
         <w:bidi/>
         <w:jc w:val="center"/>
         <w:rPr>
+          <w:sz w:val="32"/>
+          <w:szCs w:val="32"/>
+          <w:lang w:val="en-US"/>
+        </w:rPr>
+      </w:pPr>
+      <w:r>
+        <w:rPr>
           <w:rFonts w:hint="cs"/>
           <w:sz w:val="32"/>
           <w:szCs w:val="32"/>
-          <w:lang w:val="en-US"/>
-        </w:rPr>
-      </w:pPr>
+          <w:rtl/>
+          <w:lang w:val="en-US"/>
+        </w:rPr>
+        <w:t xml:space="preserve">דיאגרמות של המחלקות שמעלים לענן של </w:t>
+      </w:r>
+      <w:r>
+        <w:rPr>
+          <w:sz w:val="32"/>
+          <w:szCs w:val="32"/>
+          <w:lang w:val="en-US"/>
+        </w:rPr>
+        <w:t xml:space="preserve">mongo </w:t>
+      </w:r>
+      <w:proofErr w:type="spellStart"/>
+      <w:r>
+        <w:rPr>
+          <w:sz w:val="32"/>
+          <w:szCs w:val="32"/>
+          <w:lang w:val="en-US"/>
+        </w:rPr>
+        <w:t>db</w:t>
+      </w:r>
+      <w:proofErr w:type="spellEnd"/>
+      <w:r>
+        <w:rPr>
+          <w:sz w:val="32"/>
+          <w:szCs w:val="32"/>
+          <w:lang w:val="en-US"/>
+        </w:rPr>
+        <w:t xml:space="preserve"> atlas</w:t>
+      </w:r>
       <w:r>
         <w:rPr>
           <w:rFonts w:hint="cs"/>
@@ -35878,69 +35612,33 @@
           <w:rtl/>
           <w:lang w:val="en-US"/>
         </w:rPr>
-        <w:t xml:space="preserve">דיאגרמות של המחלקות שמעלים לענן של </w:t>
-      </w:r>
-      <w:r>
+        <w:t>.</w:t>
+      </w:r>
+    </w:p>
+    <w:p>
+      <w:pPr>
+        <w:bidi/>
+        <w:jc w:val="center"/>
         <w:rPr>
           <w:sz w:val="32"/>
           <w:szCs w:val="32"/>
-          <w:lang w:val="en-US"/>
-        </w:rPr>
-        <w:t xml:space="preserve">mongo </w:t>
-      </w:r>
-      <w:proofErr w:type="spellStart"/>
-      <w:r>
-        <w:rPr>
+          <w:rtl/>
+          <w:lang w:val="en-US"/>
+        </w:rPr>
+      </w:pPr>
+      <w:r>
+        <w:rPr>
+          <w:noProof/>
           <w:sz w:val="32"/>
           <w:szCs w:val="32"/>
-          <w:lang w:val="en-US"/>
-        </w:rPr>
-        <w:t>db</w:t>
-      </w:r>
-      <w:proofErr w:type="spellEnd"/>
-      <w:r>
-        <w:rPr>
-          <w:sz w:val="32"/>
-          <w:szCs w:val="32"/>
-          <w:lang w:val="en-US"/>
-        </w:rPr>
-        <w:t xml:space="preserve"> atlas</w:t>
-      </w:r>
-      <w:r>
-        <w:rPr>
-          <w:rFonts w:hint="cs"/>
-          <w:sz w:val="32"/>
-          <w:szCs w:val="32"/>
-          <w:rtl/>
-          <w:lang w:val="en-US"/>
-        </w:rPr>
-        <w:t>.</w:t>
-      </w:r>
-    </w:p>
-    <w:p>
-      <w:pPr>
-        <w:bidi/>
-        <w:jc w:val="center"/>
-        <w:rPr>
-          <w:rFonts w:hint="cs"/>
-          <w:sz w:val="32"/>
-          <w:szCs w:val="32"/>
-          <w:rtl/>
-          <w:lang w:val="en-US"/>
-        </w:rPr>
-      </w:pPr>
-      <w:r>
-        <w:rPr>
-          <w:sz w:val="32"/>
-          <w:szCs w:val="32"/>
           <w:rtl/>
           <w:lang w:val="en-US"/>
         </w:rPr>
         <w:drawing>
-          <wp:inline distT="0" distB="0" distL="0" distR="0" wp14:anchorId="6FC9238E" wp14:editId="506E715C">
-            <wp:extent cx="4242435" cy="4113178"/>
-            <wp:effectExtent l="0" t="0" r="5715" b="1905"/>
-            <wp:docPr id="1206271732" name="Picture 1"/>
+          <wp:inline distT="0" distB="0" distL="0" distR="0" wp14:anchorId="61835636" wp14:editId="71BCD82A">
+            <wp:extent cx="5731510" cy="3545840"/>
+            <wp:effectExtent l="0" t="0" r="2540" b="0"/>
+            <wp:docPr id="1413446320" name="Picture 1"/>
             <wp:cNvGraphicFramePr>
               <a:graphicFrameLocks xmlns:a="http://schemas.openxmlformats.org/drawingml/2006/main" noChangeAspect="1"/>
             </wp:cNvGraphicFramePr>
@@ -35948,11 +35646,11 @@
               <a:graphicData uri="http://schemas.openxmlformats.org/drawingml/2006/picture">
                 <pic:pic xmlns:pic="http://schemas.openxmlformats.org/drawingml/2006/picture">
                   <pic:nvPicPr>
-                    <pic:cNvPr id="1206271732" name=""/>
+                    <pic:cNvPr id="1413446320" name=""/>
                     <pic:cNvPicPr/>
                   </pic:nvPicPr>
                   <pic:blipFill>
-                    <a:blip r:embed="rId64"/>
+                    <a:blip r:embed="rId56"/>
                     <a:stretch>
                       <a:fillRect/>
                     </a:stretch>
@@ -35960,7 +35658,7 @@
                   <pic:spPr>
                     <a:xfrm>
                       <a:off x="0" y="0"/>
-                      <a:ext cx="4244307" cy="4114993"/>
+                      <a:ext cx="5731510" cy="3545840"/>
                     </a:xfrm>
                     <a:prstGeom prst="rect">
                       <a:avLst/>
@@ -35982,9 +35680,7 @@
     </w:p>
     <w:p>
       <w:pPr>
-        <w:tabs>
-          <w:tab w:val="left" w:pos="3675"/>
-        </w:tabs>
+        <w:suppressAutoHyphens w:val="0"/>
         <w:rPr>
           <w:rFonts w:ascii="David" w:hAnsi="David" w:cs="David"/>
           <w:b/>
@@ -35995,14 +35691,868 @@
           <w:lang w:val="en-US"/>
         </w:rPr>
       </w:pPr>
-    </w:p>
-    <w:p>
-      <w:pPr>
-        <w:rPr>
-          <w:rtl/>
-          <w:lang w:val="en-US"/>
-        </w:rPr>
-      </w:pPr>
+      <w:r>
+        <w:rPr>
+          <w:rFonts w:ascii="David" w:hAnsi="David" w:cs="David"/>
+          <w:b/>
+          <w:bCs/>
+          <w:sz w:val="36"/>
+          <w:szCs w:val="36"/>
+          <w:u w:val="single"/>
+          <w:lang w:val="en-US"/>
+        </w:rPr>
+        <w:br w:type="page"/>
+      </w:r>
+    </w:p>
+    <w:p>
+      <w:pPr>
+        <w:tabs>
+          <w:tab w:val="left" w:pos="3675"/>
+        </w:tabs>
+        <w:bidi/>
+        <w:jc w:val="center"/>
+        <w:rPr>
+          <w:rFonts w:ascii="David" w:hAnsi="David" w:cs="David"/>
+          <w:b/>
+          <w:bCs/>
+          <w:sz w:val="36"/>
+          <w:szCs w:val="36"/>
+          <w:u w:val="single"/>
+          <w:rtl/>
+          <w:lang w:val="en-US"/>
+        </w:rPr>
+      </w:pPr>
+      <w:r>
+        <w:rPr>
+          <w:rFonts w:ascii="David" w:hAnsi="David" w:cs="David" w:hint="cs"/>
+          <w:b/>
+          <w:bCs/>
+          <w:sz w:val="36"/>
+          <w:szCs w:val="36"/>
+          <w:u w:val="single"/>
+          <w:rtl/>
+          <w:lang w:val="en-US"/>
+        </w:rPr>
+        <w:lastRenderedPageBreak/>
+        <w:t xml:space="preserve">דיאגרמות של </w:t>
+      </w:r>
+      <w:proofErr w:type="spellStart"/>
+      <w:r>
+        <w:rPr>
+          <w:rFonts w:ascii="David" w:hAnsi="David" w:cs="David"/>
+          <w:b/>
+          <w:bCs/>
+          <w:sz w:val="36"/>
+          <w:szCs w:val="36"/>
+          <w:u w:val="single"/>
+          <w:lang w:val="en-US"/>
+        </w:rPr>
+        <w:t>ViewModels</w:t>
+      </w:r>
+      <w:proofErr w:type="spellEnd"/>
+    </w:p>
+    <w:p>
+      <w:pPr>
+        <w:tabs>
+          <w:tab w:val="left" w:pos="3170"/>
+        </w:tabs>
+        <w:rPr>
+          <w:lang w:val="en-US"/>
+        </w:rPr>
+      </w:pPr>
+      <w:r>
+        <w:rPr>
+          <w:noProof/>
+          <w:lang w:val="en-US"/>
+        </w:rPr>
+        <w:drawing>
+          <wp:inline distT="0" distB="0" distL="0" distR="0" wp14:anchorId="58BC00B8" wp14:editId="1C1032FE">
+            <wp:extent cx="5731510" cy="4018280"/>
+            <wp:effectExtent l="0" t="0" r="2540" b="1270"/>
+            <wp:docPr id="1251384959" name="Picture 1"/>
+            <wp:cNvGraphicFramePr>
+              <a:graphicFrameLocks xmlns:a="http://schemas.openxmlformats.org/drawingml/2006/main" noChangeAspect="1"/>
+            </wp:cNvGraphicFramePr>
+            <a:graphic xmlns:a="http://schemas.openxmlformats.org/drawingml/2006/main">
+              <a:graphicData uri="http://schemas.openxmlformats.org/drawingml/2006/picture">
+                <pic:pic xmlns:pic="http://schemas.openxmlformats.org/drawingml/2006/picture">
+                  <pic:nvPicPr>
+                    <pic:cNvPr id="1251384959" name=""/>
+                    <pic:cNvPicPr/>
+                  </pic:nvPicPr>
+                  <pic:blipFill>
+                    <a:blip r:embed="rId57"/>
+                    <a:stretch>
+                      <a:fillRect/>
+                    </a:stretch>
+                  </pic:blipFill>
+                  <pic:spPr>
+                    <a:xfrm>
+                      <a:off x="0" y="0"/>
+                      <a:ext cx="5731510" cy="4018280"/>
+                    </a:xfrm>
+                    <a:prstGeom prst="rect">
+                      <a:avLst/>
+                    </a:prstGeom>
+                  </pic:spPr>
+                </pic:pic>
+              </a:graphicData>
+            </a:graphic>
+          </wp:inline>
+        </w:drawing>
+      </w:r>
+    </w:p>
+    <w:p>
+      <w:pPr>
+        <w:bidi/>
+        <w:jc w:val="center"/>
+        <w:rPr>
+          <w:b/>
+          <w:bCs/>
+          <w:sz w:val="28"/>
+          <w:szCs w:val="28"/>
+          <w:u w:val="single"/>
+          <w:rtl/>
+          <w:lang w:val="en-US"/>
+        </w:rPr>
+      </w:pPr>
+      <w:r>
+        <w:rPr>
+          <w:rFonts w:hint="cs"/>
+          <w:b/>
+          <w:bCs/>
+          <w:sz w:val="28"/>
+          <w:szCs w:val="28"/>
+          <w:u w:val="single"/>
+          <w:rtl/>
+          <w:lang w:val="en-US"/>
+        </w:rPr>
+        <w:t xml:space="preserve">מחלקת עזר לחישובים </w:t>
+      </w:r>
+    </w:p>
+    <w:p>
+      <w:pPr>
+        <w:bidi/>
+        <w:jc w:val="center"/>
+        <w:rPr>
+          <w:sz w:val="28"/>
+          <w:szCs w:val="28"/>
+          <w:lang w:val="en-US"/>
+        </w:rPr>
+      </w:pPr>
+      <w:r>
+        <w:rPr>
+          <w:noProof/>
+          <w:sz w:val="28"/>
+          <w:szCs w:val="28"/>
+          <w:rtl/>
+          <w:lang w:val="en-US"/>
+        </w:rPr>
+        <w:drawing>
+          <wp:inline distT="0" distB="0" distL="0" distR="0" wp14:anchorId="65D02217" wp14:editId="568342D2">
+            <wp:extent cx="1862505" cy="3200400"/>
+            <wp:effectExtent l="0" t="0" r="4445" b="0"/>
+            <wp:docPr id="91127173" name="Picture 1"/>
+            <wp:cNvGraphicFramePr>
+              <a:graphicFrameLocks xmlns:a="http://schemas.openxmlformats.org/drawingml/2006/main" noChangeAspect="1"/>
+            </wp:cNvGraphicFramePr>
+            <a:graphic xmlns:a="http://schemas.openxmlformats.org/drawingml/2006/main">
+              <a:graphicData uri="http://schemas.openxmlformats.org/drawingml/2006/picture">
+                <pic:pic xmlns:pic="http://schemas.openxmlformats.org/drawingml/2006/picture">
+                  <pic:nvPicPr>
+                    <pic:cNvPr id="91127173" name=""/>
+                    <pic:cNvPicPr/>
+                  </pic:nvPicPr>
+                  <pic:blipFill>
+                    <a:blip r:embed="rId58"/>
+                    <a:stretch>
+                      <a:fillRect/>
+                    </a:stretch>
+                  </pic:blipFill>
+                  <pic:spPr>
+                    <a:xfrm>
+                      <a:off x="0" y="0"/>
+                      <a:ext cx="1863585" cy="3202256"/>
+                    </a:xfrm>
+                    <a:prstGeom prst="rect">
+                      <a:avLst/>
+                    </a:prstGeom>
+                  </pic:spPr>
+                </pic:pic>
+              </a:graphicData>
+            </a:graphic>
+          </wp:inline>
+        </w:drawing>
+      </w:r>
+    </w:p>
+    <w:p>
+      <w:pPr>
+        <w:bidi/>
+        <w:jc w:val="center"/>
+        <w:rPr>
+          <w:sz w:val="28"/>
+          <w:szCs w:val="28"/>
+          <w:lang w:val="en-US"/>
+        </w:rPr>
+      </w:pPr>
+    </w:p>
+    <w:p>
+      <w:pPr>
+        <w:bidi/>
+        <w:jc w:val="center"/>
+        <w:rPr>
+          <w:sz w:val="28"/>
+          <w:szCs w:val="28"/>
+          <w:lang w:val="en-US"/>
+        </w:rPr>
+      </w:pPr>
+    </w:p>
+    <w:p>
+      <w:pPr>
+        <w:tabs>
+          <w:tab w:val="left" w:pos="5988"/>
+        </w:tabs>
+        <w:bidi/>
+        <w:rPr>
+          <w:sz w:val="28"/>
+          <w:szCs w:val="28"/>
+          <w:rtl/>
+          <w:lang w:val="en-US"/>
+        </w:rPr>
+      </w:pPr>
+    </w:p>
+    <w:p>
+      <w:pPr>
+        <w:tabs>
+          <w:tab w:val="left" w:pos="5988"/>
+        </w:tabs>
+        <w:bidi/>
+        <w:jc w:val="center"/>
+        <w:rPr>
+          <w:b/>
+          <w:bCs/>
+          <w:sz w:val="28"/>
+          <w:szCs w:val="28"/>
+          <w:u w:val="single"/>
+          <w:lang w:val="en-US"/>
+        </w:rPr>
+      </w:pPr>
+      <w:r>
+        <w:rPr>
+          <w:rFonts w:hint="cs"/>
+          <w:b/>
+          <w:bCs/>
+          <w:sz w:val="28"/>
+          <w:szCs w:val="28"/>
+          <w:u w:val="single"/>
+          <w:rtl/>
+          <w:lang w:val="en-US"/>
+        </w:rPr>
+        <w:t>דיאגר</w:t>
+      </w:r>
+      <w:r>
+        <w:rPr>
+          <w:rFonts w:hint="cs"/>
+          <w:b/>
+          <w:bCs/>
+          <w:sz w:val="28"/>
+          <w:szCs w:val="28"/>
+          <w:u w:val="single"/>
+          <w:rtl/>
+          <w:lang w:val="en-US"/>
+        </w:rPr>
+        <w:t>מת</w:t>
+      </w:r>
+      <w:r>
+        <w:rPr>
+          <w:rFonts w:hint="cs"/>
+          <w:b/>
+          <w:bCs/>
+          <w:sz w:val="28"/>
+          <w:szCs w:val="28"/>
+          <w:u w:val="single"/>
+          <w:rtl/>
+          <w:lang w:val="en-US"/>
+        </w:rPr>
+        <w:t xml:space="preserve"> של דפי ה</w:t>
+      </w:r>
+      <w:r>
+        <w:rPr>
+          <w:b/>
+          <w:bCs/>
+          <w:sz w:val="28"/>
+          <w:szCs w:val="28"/>
+          <w:u w:val="single"/>
+          <w:lang w:val="en-US"/>
+        </w:rPr>
+        <w:t>Views</w:t>
+      </w:r>
+      <w:r>
+        <w:rPr>
+          <w:rFonts w:hint="cs"/>
+          <w:b/>
+          <w:bCs/>
+          <w:sz w:val="28"/>
+          <w:szCs w:val="28"/>
+          <w:u w:val="single"/>
+          <w:rtl/>
+          <w:lang w:val="en-US"/>
+        </w:rPr>
+        <w:t xml:space="preserve"> </w:t>
+      </w:r>
+    </w:p>
+    <w:p>
+      <w:pPr>
+        <w:bidi/>
+        <w:rPr>
+          <w:rFonts w:ascii="David" w:hAnsi="David" w:cs="David" w:hint="cs"/>
+          <w:sz w:val="28"/>
+          <w:szCs w:val="28"/>
+          <w:rtl/>
+          <w:lang w:val="en-US"/>
+        </w:rPr>
+      </w:pPr>
+      <w:r>
+        <w:rPr>
+          <w:rFonts w:ascii="David" w:hAnsi="David" w:cs="David" w:hint="cs"/>
+          <w:sz w:val="28"/>
+          <w:szCs w:val="28"/>
+          <w:rtl/>
+          <w:lang w:val="en-US"/>
+        </w:rPr>
+        <w:t xml:space="preserve">בדיאגרמות הבאות נראה את </w:t>
+      </w:r>
+      <w:r>
+        <w:rPr>
+          <w:rFonts w:ascii="David" w:hAnsi="David" w:cs="David" w:hint="cs"/>
+          <w:sz w:val="28"/>
+          <w:szCs w:val="28"/>
+          <w:rtl/>
+          <w:lang w:val="en-US"/>
+        </w:rPr>
+        <w:t>הדפים של ה</w:t>
+      </w:r>
+      <w:r>
+        <w:rPr>
+          <w:rFonts w:ascii="David" w:hAnsi="David" w:cs="David"/>
+          <w:sz w:val="28"/>
+          <w:szCs w:val="28"/>
+          <w:lang w:val="en-US"/>
+        </w:rPr>
+        <w:t>Views</w:t>
+      </w:r>
+      <w:r>
+        <w:rPr>
+          <w:rFonts w:ascii="David" w:hAnsi="David" w:cs="David" w:hint="cs"/>
+          <w:sz w:val="28"/>
+          <w:szCs w:val="28"/>
+          <w:rtl/>
+          <w:lang w:val="en-US"/>
+        </w:rPr>
+        <w:t>,שאלו בעצם דפי ה</w:t>
+      </w:r>
+      <w:r>
+        <w:rPr>
+          <w:rFonts w:ascii="David" w:hAnsi="David" w:cs="David"/>
+          <w:sz w:val="28"/>
+          <w:szCs w:val="28"/>
+          <w:lang w:val="en-US"/>
+        </w:rPr>
+        <w:t>XAML</w:t>
+      </w:r>
+      <w:r>
+        <w:rPr>
+          <w:rFonts w:ascii="David" w:hAnsi="David" w:cs="David" w:hint="cs"/>
+          <w:sz w:val="28"/>
+          <w:szCs w:val="28"/>
+          <w:rtl/>
+          <w:lang w:val="en-US"/>
+        </w:rPr>
+        <w:t xml:space="preserve"> שהמשתמש רואה </w:t>
+      </w:r>
+      <w:r>
+        <w:rPr>
+          <w:rFonts w:ascii="David" w:hAnsi="David" w:cs="David" w:hint="cs"/>
+          <w:sz w:val="28"/>
+          <w:szCs w:val="28"/>
+          <w:rtl/>
+          <w:lang w:val="en-US"/>
+        </w:rPr>
+        <w:t xml:space="preserve"> שמקשרות בין </w:t>
+      </w:r>
+      <w:r>
+        <w:rPr>
+          <w:rFonts w:ascii="David" w:hAnsi="David" w:cs="David" w:hint="cs"/>
+          <w:sz w:val="28"/>
+          <w:szCs w:val="28"/>
+          <w:rtl/>
+          <w:lang w:val="en-US"/>
+        </w:rPr>
+        <w:t>ממשק המשתמש לפונקציות שמעבירות את המשתמש לדפי ה</w:t>
+      </w:r>
+      <w:r>
+        <w:rPr>
+          <w:rFonts w:ascii="David" w:hAnsi="David" w:cs="David"/>
+          <w:sz w:val="28"/>
+          <w:szCs w:val="28"/>
+          <w:lang w:val="en-US"/>
+        </w:rPr>
+        <w:t>XAML</w:t>
+      </w:r>
+      <w:r>
+        <w:rPr>
+          <w:rFonts w:ascii="David" w:hAnsi="David" w:cs="David" w:hint="cs"/>
+          <w:sz w:val="28"/>
+          <w:szCs w:val="28"/>
+          <w:rtl/>
+          <w:lang w:val="en-US"/>
+        </w:rPr>
+        <w:t xml:space="preserve"> . </w:t>
+      </w:r>
+      <w:r>
+        <w:rPr>
+          <w:rFonts w:ascii="David" w:hAnsi="David" w:cs="David" w:hint="cs"/>
+          <w:sz w:val="28"/>
+          <w:szCs w:val="28"/>
+          <w:rtl/>
+          <w:lang w:val="en-US"/>
+        </w:rPr>
+        <w:t>הנחוצים .</w:t>
+      </w:r>
+    </w:p>
+    <w:p>
+      <w:pPr>
+        <w:bidi/>
+        <w:rPr>
+          <w:rFonts w:ascii="David" w:hAnsi="David" w:cs="David"/>
+          <w:sz w:val="28"/>
+          <w:szCs w:val="28"/>
+          <w:rtl/>
+          <w:lang w:val="en-US"/>
+        </w:rPr>
+      </w:pPr>
+    </w:p>
+    <w:p>
+      <w:pPr>
+        <w:bidi/>
+        <w:jc w:val="center"/>
+        <w:rPr>
+          <w:rFonts w:ascii="David" w:hAnsi="David" w:cs="David"/>
+          <w:b/>
+          <w:bCs/>
+          <w:sz w:val="28"/>
+          <w:szCs w:val="28"/>
+          <w:u w:val="single"/>
+          <w:rtl/>
+          <w:lang w:val="en-US"/>
+        </w:rPr>
+      </w:pPr>
+      <w:r>
+        <w:rPr>
+          <w:rFonts w:ascii="David" w:hAnsi="David" w:cs="David" w:hint="cs"/>
+          <w:b/>
+          <w:bCs/>
+          <w:sz w:val="28"/>
+          <w:szCs w:val="28"/>
+          <w:u w:val="single"/>
+          <w:rtl/>
+          <w:lang w:val="en-US"/>
+        </w:rPr>
+        <w:t>דיאגרמת רצף1</w:t>
+      </w:r>
+      <w:r>
+        <w:rPr>
+          <w:rFonts w:ascii="David" w:hAnsi="David" w:cs="David" w:hint="cs"/>
+          <w:b/>
+          <w:bCs/>
+          <w:sz w:val="28"/>
+          <w:szCs w:val="28"/>
+          <w:u w:val="single"/>
+          <w:rtl/>
+          <w:lang w:val="en-US"/>
+        </w:rPr>
+        <w:t xml:space="preserve">-התחלת טיימר </w:t>
+      </w:r>
+      <w:r>
+        <w:rPr>
+          <w:rFonts w:ascii="David" w:hAnsi="David" w:cs="David" w:hint="cs"/>
+          <w:b/>
+          <w:bCs/>
+          <w:sz w:val="28"/>
+          <w:szCs w:val="28"/>
+          <w:u w:val="single"/>
+          <w:rtl/>
+          <w:lang w:val="en-US"/>
+        </w:rPr>
+        <w:t xml:space="preserve"> </w:t>
+      </w:r>
+    </w:p>
+    <w:p>
+      <w:pPr>
+        <w:bidi/>
+        <w:rPr>
+          <w:rFonts w:ascii="David" w:hAnsi="David" w:cs="David"/>
+          <w:sz w:val="28"/>
+          <w:szCs w:val="28"/>
+          <w:rtl/>
+          <w:lang w:val="en-US"/>
+        </w:rPr>
+      </w:pPr>
+      <w:r>
+        <w:rPr>
+          <w:rFonts w:ascii="David" w:hAnsi="David" w:cs="David"/>
+          <w:sz w:val="28"/>
+          <w:szCs w:val="28"/>
+          <w:rtl/>
+          <w:lang w:val="en-US"/>
+        </w:rPr>
+        <w:drawing>
+          <wp:inline distT="0" distB="0" distL="0" distR="0" wp14:anchorId="584FA7D4" wp14:editId="301A542F">
+            <wp:extent cx="5731510" cy="2153920"/>
+            <wp:effectExtent l="0" t="0" r="2540" b="0"/>
+            <wp:docPr id="1858472465" name="Picture 1"/>
+            <wp:cNvGraphicFramePr>
+              <a:graphicFrameLocks xmlns:a="http://schemas.openxmlformats.org/drawingml/2006/main" noChangeAspect="1"/>
+            </wp:cNvGraphicFramePr>
+            <a:graphic xmlns:a="http://schemas.openxmlformats.org/drawingml/2006/main">
+              <a:graphicData uri="http://schemas.openxmlformats.org/drawingml/2006/picture">
+                <pic:pic xmlns:pic="http://schemas.openxmlformats.org/drawingml/2006/picture">
+                  <pic:nvPicPr>
+                    <pic:cNvPr id="1858472465" name=""/>
+                    <pic:cNvPicPr/>
+                  </pic:nvPicPr>
+                  <pic:blipFill>
+                    <a:blip r:embed="rId59"/>
+                    <a:stretch>
+                      <a:fillRect/>
+                    </a:stretch>
+                  </pic:blipFill>
+                  <pic:spPr>
+                    <a:xfrm>
+                      <a:off x="0" y="0"/>
+                      <a:ext cx="5731510" cy="2153920"/>
+                    </a:xfrm>
+                    <a:prstGeom prst="rect">
+                      <a:avLst/>
+                    </a:prstGeom>
+                  </pic:spPr>
+                </pic:pic>
+              </a:graphicData>
+            </a:graphic>
+          </wp:inline>
+        </w:drawing>
+      </w:r>
+    </w:p>
+    <w:p>
+      <w:pPr>
+        <w:tabs>
+          <w:tab w:val="left" w:pos="1643"/>
+        </w:tabs>
+        <w:bidi/>
+        <w:rPr>
+          <w:rFonts w:ascii="David" w:hAnsi="David" w:cs="David" w:hint="cs"/>
+          <w:sz w:val="28"/>
+          <w:szCs w:val="28"/>
+          <w:rtl/>
+          <w:lang w:val="en-US"/>
+        </w:rPr>
+      </w:pPr>
+      <w:r>
+        <w:rPr>
+          <w:rFonts w:ascii="David" w:hAnsi="David" w:cs="David" w:hint="cs"/>
+          <w:sz w:val="28"/>
+          <w:szCs w:val="28"/>
+          <w:rtl/>
+          <w:lang w:val="en-US"/>
+        </w:rPr>
+        <w:t xml:space="preserve">דיאגרמה זו מציגה את האפשרות </w:t>
+      </w:r>
+      <w:r>
+        <w:rPr>
+          <w:rFonts w:ascii="David" w:hAnsi="David" w:cs="David" w:hint="cs"/>
+          <w:sz w:val="28"/>
+          <w:szCs w:val="28"/>
+          <w:rtl/>
+          <w:lang w:val="en-US"/>
+        </w:rPr>
+        <w:t>כאשר המשתמש לוחץ על כפתור ה</w:t>
+      </w:r>
+      <w:r>
+        <w:rPr>
+          <w:rFonts w:ascii="David" w:hAnsi="David" w:cs="David"/>
+          <w:sz w:val="28"/>
+          <w:szCs w:val="28"/>
+          <w:lang w:val="en-US"/>
+        </w:rPr>
+        <w:t>Timer</w:t>
+      </w:r>
+      <w:r>
+        <w:rPr>
+          <w:rFonts w:ascii="David" w:hAnsi="David" w:cs="David" w:hint="cs"/>
+          <w:sz w:val="28"/>
+          <w:szCs w:val="28"/>
+          <w:rtl/>
+          <w:lang w:val="en-US"/>
+        </w:rPr>
+        <w:t xml:space="preserve"> בדף הראשי.</w:t>
+      </w:r>
+    </w:p>
+    <w:p>
+      <w:pPr>
+        <w:bidi/>
+        <w:rPr>
+          <w:rFonts w:ascii="David" w:hAnsi="David" w:cs="David" w:hint="cs"/>
+          <w:sz w:val="28"/>
+          <w:szCs w:val="28"/>
+          <w:lang w:val="en-US"/>
+        </w:rPr>
+      </w:pPr>
+    </w:p>
+    <w:p>
+      <w:pPr>
+        <w:bidi/>
+        <w:jc w:val="center"/>
+        <w:rPr>
+          <w:rFonts w:ascii="David" w:hAnsi="David" w:cs="David"/>
+          <w:b/>
+          <w:bCs/>
+          <w:sz w:val="28"/>
+          <w:szCs w:val="28"/>
+          <w:u w:val="single"/>
+          <w:rtl/>
+          <w:lang w:val="en-US"/>
+        </w:rPr>
+      </w:pPr>
+      <w:r>
+        <w:rPr>
+          <w:rFonts w:ascii="David" w:hAnsi="David" w:cs="David" w:hint="cs"/>
+          <w:b/>
+          <w:bCs/>
+          <w:sz w:val="28"/>
+          <w:szCs w:val="28"/>
+          <w:u w:val="single"/>
+          <w:rtl/>
+          <w:lang w:val="en-US"/>
+        </w:rPr>
+        <w:t xml:space="preserve">דיאגרמת רצף 2 </w:t>
+      </w:r>
+      <w:r>
+        <w:rPr>
+          <w:rFonts w:ascii="David" w:hAnsi="David" w:cs="David" w:hint="cs"/>
+          <w:b/>
+          <w:bCs/>
+          <w:sz w:val="28"/>
+          <w:szCs w:val="28"/>
+          <w:u w:val="single"/>
+          <w:rtl/>
+          <w:lang w:val="en-US"/>
+        </w:rPr>
+        <w:t>-בחירת מסלול קיים</w:t>
+      </w:r>
+    </w:p>
+    <w:p>
+      <w:pPr>
+        <w:bidi/>
+        <w:jc w:val="center"/>
+        <w:rPr>
+          <w:rFonts w:ascii="David" w:hAnsi="David" w:cs="David"/>
+          <w:sz w:val="28"/>
+          <w:szCs w:val="28"/>
+          <w:rtl/>
+          <w:lang w:val="en-US"/>
+        </w:rPr>
+      </w:pPr>
+      <w:r>
+        <w:rPr>
+          <w:rFonts w:ascii="David" w:hAnsi="David" w:cs="David"/>
+          <w:sz w:val="28"/>
+          <w:szCs w:val="28"/>
+          <w:rtl/>
+          <w:lang w:val="en-US"/>
+        </w:rPr>
+        <w:lastRenderedPageBreak/>
+        <w:drawing>
+          <wp:inline distT="0" distB="0" distL="0" distR="0" wp14:anchorId="6F9D9CB0" wp14:editId="415DD701">
+            <wp:extent cx="5731510" cy="4258945"/>
+            <wp:effectExtent l="0" t="0" r="2540" b="8255"/>
+            <wp:docPr id="273873515" name="Picture 1"/>
+            <wp:cNvGraphicFramePr>
+              <a:graphicFrameLocks xmlns:a="http://schemas.openxmlformats.org/drawingml/2006/main" noChangeAspect="1"/>
+            </wp:cNvGraphicFramePr>
+            <a:graphic xmlns:a="http://schemas.openxmlformats.org/drawingml/2006/main">
+              <a:graphicData uri="http://schemas.openxmlformats.org/drawingml/2006/picture">
+                <pic:pic xmlns:pic="http://schemas.openxmlformats.org/drawingml/2006/picture">
+                  <pic:nvPicPr>
+                    <pic:cNvPr id="273873515" name=""/>
+                    <pic:cNvPicPr/>
+                  </pic:nvPicPr>
+                  <pic:blipFill>
+                    <a:blip r:embed="rId60"/>
+                    <a:stretch>
+                      <a:fillRect/>
+                    </a:stretch>
+                  </pic:blipFill>
+                  <pic:spPr>
+                    <a:xfrm>
+                      <a:off x="0" y="0"/>
+                      <a:ext cx="5731510" cy="4258945"/>
+                    </a:xfrm>
+                    <a:prstGeom prst="rect">
+                      <a:avLst/>
+                    </a:prstGeom>
+                  </pic:spPr>
+                </pic:pic>
+              </a:graphicData>
+            </a:graphic>
+          </wp:inline>
+        </w:drawing>
+      </w:r>
+    </w:p>
+    <w:p>
+      <w:pPr>
+        <w:bidi/>
+        <w:rPr>
+          <w:rFonts w:ascii="David" w:hAnsi="David" w:cs="David"/>
+          <w:sz w:val="28"/>
+          <w:szCs w:val="28"/>
+          <w:lang w:val="en-US"/>
+        </w:rPr>
+      </w:pPr>
+    </w:p>
+    <w:p>
+      <w:pPr>
+        <w:tabs>
+          <w:tab w:val="left" w:pos="4045"/>
+        </w:tabs>
+        <w:bidi/>
+        <w:rPr>
+          <w:rFonts w:ascii="David" w:hAnsi="David" w:cs="David"/>
+          <w:sz w:val="28"/>
+          <w:szCs w:val="28"/>
+          <w:rtl/>
+          <w:lang w:val="en-US"/>
+        </w:rPr>
+      </w:pPr>
+      <w:r>
+        <w:rPr>
+          <w:rFonts w:ascii="David" w:hAnsi="David" w:cs="David"/>
+          <w:sz w:val="28"/>
+          <w:szCs w:val="28"/>
+          <w:rtl/>
+          <w:lang w:val="en-US"/>
+        </w:rPr>
+        <w:tab/>
+      </w:r>
+    </w:p>
+    <w:p>
+      <w:pPr>
+        <w:tabs>
+          <w:tab w:val="left" w:pos="4045"/>
+        </w:tabs>
+        <w:bidi/>
+        <w:jc w:val="center"/>
+        <w:rPr>
+          <w:rFonts w:ascii="David" w:hAnsi="David" w:cs="David"/>
+          <w:b/>
+          <w:bCs/>
+          <w:sz w:val="28"/>
+          <w:szCs w:val="28"/>
+          <w:u w:val="single"/>
+          <w:rtl/>
+          <w:lang w:val="en-US"/>
+        </w:rPr>
+      </w:pPr>
+      <w:r>
+        <w:rPr>
+          <w:rFonts w:ascii="David" w:hAnsi="David" w:cs="David" w:hint="cs"/>
+          <w:b/>
+          <w:bCs/>
+          <w:sz w:val="28"/>
+          <w:szCs w:val="28"/>
+          <w:u w:val="single"/>
+          <w:rtl/>
+          <w:lang w:val="en-US"/>
+        </w:rPr>
+        <w:t xml:space="preserve">דיאגרמת רצף 3 </w:t>
+      </w:r>
+      <w:r>
+        <w:rPr>
+          <w:rFonts w:ascii="David" w:hAnsi="David" w:cs="David" w:hint="cs"/>
+          <w:b/>
+          <w:bCs/>
+          <w:sz w:val="28"/>
+          <w:szCs w:val="28"/>
+          <w:u w:val="single"/>
+          <w:rtl/>
+          <w:lang w:val="en-US"/>
+        </w:rPr>
+        <w:t xml:space="preserve">-יצירת מסלול חדש </w:t>
+      </w:r>
+    </w:p>
+    <w:p>
+      <w:pPr>
+        <w:tabs>
+          <w:tab w:val="left" w:pos="4045"/>
+        </w:tabs>
+        <w:bidi/>
+        <w:jc w:val="center"/>
+        <w:rPr>
+          <w:rFonts w:ascii="David" w:hAnsi="David" w:cs="David" w:hint="cs"/>
+          <w:b/>
+          <w:bCs/>
+          <w:sz w:val="28"/>
+          <w:szCs w:val="28"/>
+          <w:u w:val="single"/>
+          <w:rtl/>
+          <w:lang w:val="en-US"/>
+        </w:rPr>
+      </w:pPr>
+      <w:r>
+        <w:rPr>
+          <w:rFonts w:ascii="David" w:hAnsi="David" w:cs="David"/>
+          <w:b/>
+          <w:bCs/>
+          <w:sz w:val="28"/>
+          <w:szCs w:val="28"/>
+          <w:rtl/>
+          <w:lang w:val="en-US"/>
+        </w:rPr>
+        <w:drawing>
+          <wp:inline distT="0" distB="0" distL="0" distR="0" wp14:anchorId="3696003E" wp14:editId="3D64F379">
+            <wp:extent cx="5731510" cy="2637790"/>
+            <wp:effectExtent l="0" t="0" r="2540" b="0"/>
+            <wp:docPr id="1004729947" name="Picture 1"/>
+            <wp:cNvGraphicFramePr>
+              <a:graphicFrameLocks xmlns:a="http://schemas.openxmlformats.org/drawingml/2006/main" noChangeAspect="1"/>
+            </wp:cNvGraphicFramePr>
+            <a:graphic xmlns:a="http://schemas.openxmlformats.org/drawingml/2006/main">
+              <a:graphicData uri="http://schemas.openxmlformats.org/drawingml/2006/picture">
+                <pic:pic xmlns:pic="http://schemas.openxmlformats.org/drawingml/2006/picture">
+                  <pic:nvPicPr>
+                    <pic:cNvPr id="1004729947" name=""/>
+                    <pic:cNvPicPr/>
+                  </pic:nvPicPr>
+                  <pic:blipFill>
+                    <a:blip r:embed="rId61"/>
+                    <a:stretch>
+                      <a:fillRect/>
+                    </a:stretch>
+                  </pic:blipFill>
+                  <pic:spPr>
+                    <a:xfrm>
+                      <a:off x="0" y="0"/>
+                      <a:ext cx="5731510" cy="2637790"/>
+                    </a:xfrm>
+                    <a:prstGeom prst="rect">
+                      <a:avLst/>
+                    </a:prstGeom>
+                  </pic:spPr>
+                </pic:pic>
+              </a:graphicData>
+            </a:graphic>
+          </wp:inline>
+        </w:drawing>
+      </w:r>
     </w:p>
     <w:sectPr>
       <w:pgSz w:w="11906" w:h="16838"/>
@@ -36072,7 +36622,7 @@
     <mc:AlternateContent>
       <mc:Choice Requires="v">
         <w:pict>
-          <v:shapetype w14:anchorId="17FC2582" id="_x0000_t75" coordsize="21600,21600" o:spt="75" o:preferrelative="t" path="m@4@5l@4@11@9@11@9@5xe" filled="f" stroked="f">
+          <v:shapetype w14:anchorId="5387B9DE" id="_x0000_t75" coordsize="21600,21600" o:spt="75" o:preferrelative="t" path="m@4@5l@4@11@9@11@9@5xe" filled="f" stroked="f">
             <v:stroke joinstyle="miter"/>
             <v:formulas>
               <v:f eqn="if lineDrawn pixelLineWidth 0"/>
@@ -36098,7 +36648,7 @@
       </mc:Choice>
       <mc:Fallback>
         <w:drawing>
-          <wp:inline distT="0" distB="0" distL="0" distR="0" wp14:anchorId="0B0FF360" wp14:editId="0B0FF361">
+          <wp:inline distT="0" distB="0" distL="0" distR="0" wp14:anchorId="728365BC" wp14:editId="728365BD">
             <wp:extent cx="638175" cy="733425"/>
             <wp:effectExtent l="0" t="0" r="0" b="0"/>
             <wp:docPr id="264843519" name="Picture 264843519" descr="A black and white stopwatch&#10;&#10;Description automatically generated"/>
@@ -42167,120 +42717,6 @@
           <inkml:channelProperty channel="F" name="resolution" value="0" units="1/dev"/>
         </inkml:channelProperties>
       </inkml:inkSource>
-      <inkml:timestamp xml:id="ts0" timeString="2025-02-13T19:09:00.595"/>
-    </inkml:context>
-    <inkml:brush xml:id="br0">
-      <inkml:brushProperty name="width" value="0.05" units="cm"/>
-      <inkml:brushProperty name="height" value="0.05" units="cm"/>
-      <inkml:brushProperty name="color" value="#FFFFFF"/>
-    </inkml:brush>
-  </inkml:definitions>
-  <inkml:trace contextRef="#ctx0" brushRef="#br0">0 9 24575,'1'-1'0,"-1"1"0,0 0 0,0-1 0,1 1 0,-1 0 0,0-1 0,0 1 0,1 0 0,-1 0 0,0-1 0,1 1 0,-1 0 0,1 0 0,-1 0 0,0-1 0,1 1 0,-1 0 0,0 0 0,1 0 0,-1 0 0,1 0 0,-1 0 0,0 0 0,1 0 0,14-2 0,-13 2 0,35-1 0,57 5 0,-6 0 0,-72-3 0,1 1 0,24 5 0,-24-3 0,35 2 0,67-6 0,33 1 0,-28 8-1365,-71-4-5461</inkml:trace>
-  <inkml:trace contextRef="#ctx0" brushRef="#br0" timeOffset="1633.82">54 247 24575,'290'0'0,"-262"-1"0,39-7 0,-39 4 0,37-1 0,83 5-1365,-129 0-5461</inkml:trace>
-  <inkml:trace contextRef="#ctx0" brushRef="#br0" timeOffset="3107.71">45 371 24575,'0'0'0,"0"0"0,0 0 0,-1 0 0,1 1 0,0-1 0,0 0 0,0 0 0,-1 0 0,1 1 0,0-1 0,0 0 0,0 0 0,0 1 0,0-1 0,0 0 0,0 0 0,-1 1 0,1-1 0,0 0 0,0 0 0,0 1 0,0-1 0,0 0 0,0 0 0,0 1 0,0-1 0,0 0 0,0 0 0,1 1 0,-1-1 0,0 0 0,0 0 0,0 1 0,0-1 0,0 0 0,0 0 0,1 1 0,-1-1 0,0 0 0,0 0 0,0 0 0,0 1 0,1-1 0,-1 0 0,0 0 0,0 0 0,1 0 0,-1 0 0,0 0 0,0 1 0,0-1 0,1 0 0,-1 0 0,0 0 0,1 0 0,-1 0 0,0 0 0,0 0 0,1 0 0,-1 0 0,0 0 0,0 0 0,1 0 0,19 2 0,-2-3 0,163-2 0,-146 4 0,1 2 0,0 2 0,35 9 0,63 9 0,-67-8-1365,-51-11-5461</inkml:trace>
-</inkml:ink>
-</file>
-
-<file path=word/ink/ink2.xml><?xml version="1.0" encoding="utf-8"?>
-<inkml:ink xmlns:inkml="http://www.w3.org/2003/InkML">
-  <inkml:definitions>
-    <inkml:context xml:id="ctx0">
-      <inkml:inkSource xml:id="inkSrc0">
-        <inkml:traceFormat>
-          <inkml:channel name="X" type="integer" min="-2.14748E9" max="2.14748E9" units="cm"/>
-          <inkml:channel name="Y" type="integer" min="-2.14748E9" max="2.14748E9" units="cm"/>
-          <inkml:channel name="F" type="integer" max="32767" units="dev"/>
-        </inkml:traceFormat>
-        <inkml:channelProperties>
-          <inkml:channelProperty channel="X" name="resolution" value="1000" units="1/cm"/>
-          <inkml:channelProperty channel="Y" name="resolution" value="1000" units="1/cm"/>
-          <inkml:channelProperty channel="F" name="resolution" value="0" units="1/dev"/>
-        </inkml:channelProperties>
-      </inkml:inkSource>
-      <inkml:timestamp xml:id="ts0" timeString="2025-02-13T19:08:54.133"/>
-    </inkml:context>
-    <inkml:brush xml:id="br0">
-      <inkml:brushProperty name="width" value="0.35" units="cm"/>
-      <inkml:brushProperty name="height" value="0.35" units="cm"/>
-      <inkml:brushProperty name="color" value="#FFFFFF"/>
-    </inkml:brush>
-  </inkml:definitions>
-  <inkml:trace contextRef="#ctx0" brushRef="#br0">1 1 24575,'0'0'0,"0"1"0,1-1 0,-1 0 0,0 1 0,1-1 0,-1 0 0,1 1 0,-1-1 0,0 0 0,1 1 0,-1-1 0,1 0 0,-1 0 0,1 0 0,-1 1 0,1-1 0,-1 0 0,1 0 0,-1 0 0,1 0 0,-1 0 0,1 0 0,0 0 0,16 1 0,-14 0 0,318 2 0,-178-5 0,158 2 0,-286 1 8,0 1 0,-1 0-1,23 6 1,-3 0-1404</inkml:trace>
-</inkml:ink>
-</file>
-
-<file path=word/ink/ink3.xml><?xml version="1.0" encoding="utf-8"?>
-<inkml:ink xmlns:inkml="http://www.w3.org/2003/InkML">
-  <inkml:definitions>
-    <inkml:context xml:id="ctx0">
-      <inkml:inkSource xml:id="inkSrc0">
-        <inkml:traceFormat>
-          <inkml:channel name="X" type="integer" min="-2.14748E9" max="2.14748E9" units="cm"/>
-          <inkml:channel name="Y" type="integer" min="-2.14748E9" max="2.14748E9" units="cm"/>
-          <inkml:channel name="F" type="integer" max="32767" units="dev"/>
-        </inkml:traceFormat>
-        <inkml:channelProperties>
-          <inkml:channelProperty channel="X" name="resolution" value="1000" units="1/cm"/>
-          <inkml:channelProperty channel="Y" name="resolution" value="1000" units="1/cm"/>
-          <inkml:channelProperty channel="F" name="resolution" value="0" units="1/dev"/>
-        </inkml:channelProperties>
-      </inkml:inkSource>
-      <inkml:timestamp xml:id="ts0" timeString="2025-02-13T19:08:52.646"/>
-    </inkml:context>
-    <inkml:brush xml:id="br0">
-      <inkml:brushProperty name="width" value="0.35" units="cm"/>
-      <inkml:brushProperty name="height" value="0.35" units="cm"/>
-      <inkml:brushProperty name="color" value="#FFFFFF"/>
-    </inkml:brush>
-  </inkml:definitions>
-  <inkml:trace contextRef="#ctx0" brushRef="#br0">0 0 24575,'387'0'0,"-362"2"0,-1 0 0,1 2 0,47 12 0,-22-3 0,-26-8 0,-14-3 0,1 0 0,-1 0 0,0 1 0,15 7 0,-2 0 0,-1-2 0,2 0 0,36 7 0,-4-2 0,113 39 110,-69-20-1585</inkml:trace>
-</inkml:ink>
-</file>
-
-<file path=word/ink/ink4.xml><?xml version="1.0" encoding="utf-8"?>
-<inkml:ink xmlns:inkml="http://www.w3.org/2003/InkML">
-  <inkml:definitions>
-    <inkml:context xml:id="ctx0">
-      <inkml:inkSource xml:id="inkSrc0">
-        <inkml:traceFormat>
-          <inkml:channel name="X" type="integer" min="-2.14748E9" max="2.14748E9" units="cm"/>
-          <inkml:channel name="Y" type="integer" min="-2.14748E9" max="2.14748E9" units="cm"/>
-          <inkml:channel name="F" type="integer" max="32767" units="dev"/>
-        </inkml:traceFormat>
-        <inkml:channelProperties>
-          <inkml:channelProperty channel="X" name="resolution" value="1000" units="1/cm"/>
-          <inkml:channelProperty channel="Y" name="resolution" value="1000" units="1/cm"/>
-          <inkml:channelProperty channel="F" name="resolution" value="0" units="1/dev"/>
-        </inkml:channelProperties>
-      </inkml:inkSource>
-      <inkml:timestamp xml:id="ts0" timeString="2025-02-13T19:08:51.267"/>
-    </inkml:context>
-    <inkml:brush xml:id="br0">
-      <inkml:brushProperty name="width" value="0.35" units="cm"/>
-      <inkml:brushProperty name="height" value="0.35" units="cm"/>
-      <inkml:brushProperty name="color" value="#FFFFFF"/>
-    </inkml:brush>
-  </inkml:definitions>
-  <inkml:trace contextRef="#ctx0" brushRef="#br0">0 19 24575,'98'1'0,"107"-2"0,-121-8 0,11 0 0,-57 9 0,1 2 0,47 8 0,245 43-1365,-276-45-5461</inkml:trace>
-</inkml:ink>
-</file>
-
-<file path=word/ink/ink5.xml><?xml version="1.0" encoding="utf-8"?>
-<inkml:ink xmlns:inkml="http://www.w3.org/2003/InkML">
-  <inkml:definitions>
-    <inkml:context xml:id="ctx0">
-      <inkml:inkSource xml:id="inkSrc0">
-        <inkml:traceFormat>
-          <inkml:channel name="X" type="integer" min="-2.14748E9" max="2.14748E9" units="cm"/>
-          <inkml:channel name="Y" type="integer" min="-2.14748E9" max="2.14748E9" units="cm"/>
-          <inkml:channel name="F" type="integer" max="32767" units="dev"/>
-        </inkml:traceFormat>
-        <inkml:channelProperties>
-          <inkml:channelProperty channel="X" name="resolution" value="1000" units="1/cm"/>
-          <inkml:channelProperty channel="Y" name="resolution" value="1000" units="1/cm"/>
-          <inkml:channelProperty channel="F" name="resolution" value="0" units="1/dev"/>
-        </inkml:channelProperties>
-      </inkml:inkSource>
       <inkml:timestamp xml:id="ts0" timeString="2025-02-14T16:11:39.134"/>
     </inkml:context>
     <inkml:brush xml:id="br0">
@@ -42311,7 +42747,7 @@
 </inkml:ink>
 </file>
 
-<file path=word/ink/ink6.xml><?xml version="1.0" encoding="utf-8"?>
+<file path=word/ink/ink2.xml><?xml version="1.0" encoding="utf-8"?>
 <inkml:ink xmlns:inkml="http://www.w3.org/2003/InkML">
   <inkml:definitions>
     <inkml:context xml:id="ctx0">
@@ -42339,7 +42775,7 @@
 </inkml:ink>
 </file>
 
-<file path=word/ink/ink7.xml><?xml version="1.0" encoding="utf-8"?>
+<file path=word/ink/ink3.xml><?xml version="1.0" encoding="utf-8"?>
 <inkml:ink xmlns:inkml="http://www.w3.org/2003/InkML">
   <inkml:definitions>
     <inkml:context xml:id="ctx0">

</xml_diff>